<commit_message>
Add updated resume files
</commit_message>
<xml_diff>
--- a/Srikara Viswanadham.docx
+++ b/Srikara Viswanadham.docx
@@ -9,6 +9,8 @@
         <w:rPr>
           <w:rFonts w:ascii="Garamond" w:eastAsia="Garamond" w:hAnsi="Garamond" w:cs="Garamond"/>
           <w:color w:val="404040"/>
+          <w:sz w:val="28"/>
+          <w:szCs w:val="28"/>
         </w:rPr>
       </w:pPr>
       <w:r>
@@ -16,6 +18,8 @@
           <w:rFonts w:ascii="Garamond" w:eastAsia="Garamond" w:hAnsi="Garamond" w:cs="Garamond"/>
           <w:b/>
           <w:color w:val="404040"/>
+          <w:sz w:val="28"/>
+          <w:szCs w:val="28"/>
         </w:rPr>
         <w:t>SRIKARA VISWANADHAM</w:t>
       </w:r>
@@ -29,63 +33,63 @@
         <w:jc w:val="center"/>
         <w:rPr>
           <w:rFonts w:ascii="Garamond" w:hAnsi="Garamond"/>
-          <w:sz w:val="20"/>
-          <w:szCs w:val="20"/>
-        </w:rPr>
-      </w:pPr>
-      <w:r>
-        <w:rPr>
-          <w:rFonts w:ascii="Garamond" w:eastAsia="Garamond" w:hAnsi="Garamond" w:cs="Garamond"/>
-          <w:sz w:val="20"/>
-          <w:szCs w:val="20"/>
+          <w:sz w:val="22"/>
+          <w:szCs w:val="22"/>
+        </w:rPr>
+      </w:pPr>
+      <w:r>
+        <w:rPr>
+          <w:rFonts w:ascii="Garamond" w:eastAsia="Garamond" w:hAnsi="Garamond" w:cs="Garamond"/>
+          <w:sz w:val="22"/>
+          <w:szCs w:val="22"/>
         </w:rPr>
         <w:t>Mobile:</w:t>
       </w:r>
       <w:r>
         <w:rPr>
           <w:rFonts w:ascii="Garamond" w:eastAsia="Garamond" w:hAnsi="Garamond" w:cs="Garamond"/>
-          <w:sz w:val="20"/>
-          <w:szCs w:val="20"/>
+          <w:sz w:val="22"/>
+          <w:szCs w:val="22"/>
         </w:rPr>
         <w:t xml:space="preserve"> 96525 40087</w:t>
       </w:r>
       <w:r>
         <w:rPr>
           <w:rFonts w:ascii="Garamond" w:eastAsia="Garamond" w:hAnsi="Garamond" w:cs="Garamond"/>
-          <w:sz w:val="20"/>
-          <w:szCs w:val="20"/>
+          <w:sz w:val="22"/>
+          <w:szCs w:val="22"/>
         </w:rPr>
         <w:t xml:space="preserve"> </w:t>
       </w:r>
       <w:r>
         <w:rPr>
           <w:rFonts w:ascii="Garamond" w:eastAsia="Garamond" w:hAnsi="Garamond" w:cs="Garamond"/>
-          <w:sz w:val="20"/>
-          <w:szCs w:val="20"/>
+          <w:sz w:val="22"/>
+          <w:szCs w:val="22"/>
         </w:rPr>
         <w:t>|</w:t>
       </w:r>
       <w:r>
         <w:rPr>
           <w:rFonts w:ascii="Garamond" w:eastAsia="Garamond" w:hAnsi="Garamond" w:cs="Garamond"/>
-          <w:sz w:val="20"/>
-          <w:szCs w:val="20"/>
+          <w:sz w:val="22"/>
+          <w:szCs w:val="22"/>
         </w:rPr>
         <w:t xml:space="preserve"> </w:t>
       </w:r>
       <w:r>
         <w:rPr>
           <w:rFonts w:ascii="Garamond" w:eastAsia="Garamond" w:hAnsi="Garamond" w:cs="Garamond"/>
-          <w:sz w:val="20"/>
-          <w:szCs w:val="20"/>
+          <w:sz w:val="22"/>
+          <w:szCs w:val="22"/>
         </w:rPr>
         <w:t xml:space="preserve">Mail: </w:t>
       </w:r>
       <w:r>
         <w:rPr>
           <w:rFonts w:ascii="Garamond" w:eastAsia="Garamond" w:hAnsi="Garamond" w:cs="Garamond"/>
-          <w:sz w:val="20"/>
-          <w:szCs w:val="20"/>
+          <w:sz w:val="22"/>
+          <w:szCs w:val="22"/>
         </w:rPr>
         <w:t xml:space="preserve"> </w:t>
       </w:r>
@@ -95,8 +99,8 @@
             <w:rStyle w:val="Hyperlink"/>
             <w:rFonts w:ascii="Garamond" w:eastAsia="Garamond" w:hAnsi="Garamond" w:cs="Garamond"/>
             <w:color w:val="000000" w:themeColor="text1"/>
-            <w:sz w:val="20"/>
-            <w:szCs w:val="20"/>
+            <w:sz w:val="22"/>
+            <w:szCs w:val="22"/>
             <w:u w:val="none"/>
           </w:rPr>
           <w:t>srikarviswandham@gmail.com</w:t>
@@ -105,8 +109,8 @@
       <w:r>
         <w:rPr>
           <w:rFonts w:ascii="Garamond" w:hAnsi="Garamond"/>
-          <w:sz w:val="20"/>
-          <w:szCs w:val="20"/>
+          <w:sz w:val="22"/>
+          <w:szCs w:val="22"/>
         </w:rPr>
         <w:t xml:space="preserve"> </w:t>
       </w:r>
@@ -120,55 +124,55 @@
         <w:jc w:val="center"/>
         <w:rPr>
           <w:rFonts w:ascii="Garamond" w:hAnsi="Garamond"/>
-          <w:sz w:val="20"/>
-          <w:szCs w:val="20"/>
+          <w:sz w:val="22"/>
+          <w:szCs w:val="22"/>
         </w:rPr>
       </w:pPr>
       <w:r>
         <w:rPr>
           <w:rFonts w:ascii="Garamond" w:hAnsi="Garamond"/>
-          <w:sz w:val="20"/>
-          <w:szCs w:val="20"/>
+          <w:sz w:val="22"/>
+          <w:szCs w:val="22"/>
         </w:rPr>
         <w:t>Location</w:t>
       </w:r>
       <w:r>
         <w:rPr>
           <w:rFonts w:ascii="Garamond" w:hAnsi="Garamond"/>
-          <w:sz w:val="20"/>
-          <w:szCs w:val="20"/>
+          <w:sz w:val="22"/>
+          <w:szCs w:val="22"/>
         </w:rPr>
         <w:t xml:space="preserve">: </w:t>
       </w:r>
       <w:r>
         <w:rPr>
           <w:rFonts w:ascii="Garamond" w:hAnsi="Garamond"/>
-          <w:sz w:val="20"/>
-          <w:szCs w:val="20"/>
+          <w:sz w:val="22"/>
+          <w:szCs w:val="22"/>
         </w:rPr>
         <w:t>Hyderabad</w:t>
       </w:r>
       <w:r>
         <w:rPr>
           <w:rFonts w:ascii="Garamond" w:hAnsi="Garamond"/>
-          <w:sz w:val="20"/>
-          <w:szCs w:val="20"/>
+          <w:sz w:val="22"/>
+          <w:szCs w:val="22"/>
         </w:rPr>
         <w:t xml:space="preserve"> |</w:t>
       </w:r>
       <w:r>
         <w:rPr>
           <w:rFonts w:ascii="Garamond" w:hAnsi="Garamond"/>
-          <w:sz w:val="20"/>
-          <w:szCs w:val="20"/>
+          <w:sz w:val="22"/>
+          <w:szCs w:val="22"/>
         </w:rPr>
         <w:t xml:space="preserve"> </w:t>
       </w:r>
       <w:r>
         <w:rPr>
           <w:rFonts w:ascii="Garamond" w:hAnsi="Garamond"/>
-          <w:sz w:val="20"/>
-          <w:szCs w:val="20"/>
+          <w:sz w:val="22"/>
+          <w:szCs w:val="22"/>
         </w:rPr>
         <w:t>LinkedIn: https://www.linkedin.com/in/srikara-viswanadham-6970881b8</w:t>
       </w:r>
@@ -182,8 +186,8 @@
         <w:rPr>
           <w:rFonts w:ascii="Garamond" w:eastAsia="Garamond" w:hAnsi="Garamond" w:cs="Garamond"/>
           <w:color w:val="404040"/>
-          <w:sz w:val="4"/>
-          <w:szCs w:val="4"/>
+          <w:sz w:val="6"/>
+          <w:szCs w:val="6"/>
         </w:rPr>
       </w:pPr>
     </w:p>
@@ -196,6 +200,81 @@
         <w:tabs>
           <w:tab w:val="left" w:pos="900"/>
         </w:tabs>
+        <w:rPr>
+          <w:rFonts w:ascii="Garamond" w:eastAsia="Garamond" w:hAnsi="Garamond" w:cs="Garamond"/>
+          <w:b/>
+          <w:color w:val="404040"/>
+          <w:sz w:val="22"/>
+          <w:szCs w:val="22"/>
+        </w:rPr>
+      </w:pPr>
+      <w:r>
+        <w:rPr>
+          <w:rFonts w:ascii="Garamond" w:eastAsia="Garamond" w:hAnsi="Garamond" w:cs="Garamond"/>
+          <w:b/>
+          <w:color w:val="404040"/>
+          <w:sz w:val="22"/>
+          <w:szCs w:val="22"/>
+        </w:rPr>
+        <w:t>PROFILE SUMMARY</w:t>
+      </w:r>
+    </w:p>
+    <w:p>
+      <w:pPr>
+        <w:pStyle w:val="Normal1"/>
+        <w:pBdr>
+          <w:bottom w:val="single" w:sz="6" w:space="1" w:color="000000"/>
+        </w:pBdr>
+        <w:tabs>
+          <w:tab w:val="left" w:pos="900"/>
+        </w:tabs>
+        <w:rPr>
+          <w:rFonts w:ascii="Garamond" w:eastAsia="Garamond" w:hAnsi="Garamond" w:cs="Garamond"/>
+          <w:sz w:val="20"/>
+          <w:szCs w:val="20"/>
+        </w:rPr>
+      </w:pPr>
+      <w:r>
+        <w:rPr>
+          <w:rFonts w:ascii="Garamond" w:eastAsia="Garamond" w:hAnsi="Garamond" w:cs="Garamond"/>
+          <w:sz w:val="20"/>
+          <w:szCs w:val="20"/>
+        </w:rPr>
+        <w:t>AI Engineer with hands-on experience building autonomous LLM-powered agents, fine-tuning foundation models, and deploying ML pipelines for enterprise document intelligence. Proven track record delivering end-to-end automation solutions across Finance and HR domains at GMR Group, including agentic workflows, unstructured data extraction, and real-time analytics. Experienced with the full lifecycle from Solution Design to production deployment using Python, Automation Anywhere, Power BI, and Streamlit. Previously contributed to frontier model optimization at GlobalLogic, including Gemini fine-tuning and Google VEO2.</w:t>
+      </w:r>
+    </w:p>
+    <w:p>
+      <w:pPr>
+        <w:pStyle w:val="Normal1"/>
+        <w:pBdr>
+          <w:bottom w:val="single" w:sz="6" w:space="1" w:color="000000"/>
+        </w:pBdr>
+        <w:tabs>
+          <w:tab w:val="left" w:pos="900"/>
+        </w:tabs>
+        <w:rPr>
+          <w:rFonts w:ascii="Garamond" w:eastAsia="Garamond" w:hAnsi="Garamond" w:cs="Garamond"/>
+          <w:sz w:val="6"/>
+          <w:szCs w:val="6"/>
+        </w:rPr>
+      </w:pPr>
+    </w:p>
+    <w:p>
+      <w:pPr>
+        <w:pStyle w:val="Normal1"/>
+        <w:pBdr>
+          <w:bottom w:val="single" w:sz="6" w:space="1" w:color="000000"/>
+        </w:pBdr>
+        <w:tabs>
+          <w:tab w:val="left" w:pos="900"/>
+        </w:tabs>
+        <w:rPr>
+          <w:rFonts w:ascii="Garamond" w:eastAsia="Garamond" w:hAnsi="Garamond" w:cs="Garamond"/>
+          <w:sz w:val="20"/>
+          <w:szCs w:val="20"/>
+        </w:rPr>
+      </w:pPr>
+      <w:r>
         <w:rPr>
           <w:rFonts w:ascii="Garamond" w:eastAsia="Garamond" w:hAnsi="Garamond" w:cs="Garamond"/>
           <w:b/>
@@ -203,119 +282,92 @@
           <w:sz w:val="20"/>
           <w:szCs w:val="20"/>
         </w:rPr>
+        <w:t>EDUCATION</w:t>
+      </w:r>
+      <w:r>
+        <w:rPr>
+          <w:rFonts w:ascii="Garamond" w:eastAsia="Garamond" w:hAnsi="Garamond" w:cs="Garamond"/>
+          <w:sz w:val="20"/>
+          <w:szCs w:val="20"/>
+        </w:rPr>
+        <w:tab/>
+      </w:r>
+    </w:p>
+    <w:p>
+      <w:pPr>
+        <w:pStyle w:val="Normal1"/>
+        <w:tabs>
+          <w:tab w:val="left" w:pos="900"/>
+        </w:tabs>
+        <w:rPr>
+          <w:rFonts w:ascii="Garamond" w:eastAsia="Garamond" w:hAnsi="Garamond" w:cs="Garamond"/>
+          <w:color w:val="404040"/>
+          <w:sz w:val="6"/>
+          <w:szCs w:val="6"/>
+        </w:rPr>
+      </w:pPr>
+    </w:p>
+    <w:p>
+      <w:pPr>
+        <w:pStyle w:val="Normal1"/>
+        <w:tabs>
+          <w:tab w:val="left" w:pos="900"/>
+        </w:tabs>
+        <w:rPr>
+          <w:rFonts w:ascii="Garamond" w:eastAsia="Garamond" w:hAnsi="Garamond" w:cs="Garamond"/>
+          <w:color w:val="404040"/>
+          <w:sz w:val="6"/>
+          <w:szCs w:val="6"/>
+        </w:rPr>
+      </w:pPr>
+    </w:p>
+    <w:p>
+      <w:pPr>
+        <w:pStyle w:val="Normal1"/>
+        <w:tabs>
+          <w:tab w:val="left" w:pos="1134"/>
+          <w:tab w:val="right" w:pos="10503"/>
+        </w:tabs>
+        <w:rPr>
+          <w:rFonts w:ascii="Garamond" w:eastAsia="Garamond" w:hAnsi="Garamond" w:cs="Garamond"/>
+          <w:sz w:val="22"/>
+          <w:szCs w:val="22"/>
+        </w:rPr>
       </w:pPr>
       <w:r>
         <w:rPr>
           <w:rFonts w:ascii="Garamond" w:eastAsia="Garamond" w:hAnsi="Garamond" w:cs="Garamond"/>
           <w:b/>
           <w:color w:val="404040"/>
-          <w:sz w:val="20"/>
-          <w:szCs w:val="20"/>
-        </w:rPr>
-        <w:t>PROFILE SUMMARY</w:t>
-      </w:r>
-    </w:p>
-    <w:p>
-      <w:pPr>
-        <w:pStyle w:val="Normal1"/>
-        <w:pBdr>
-          <w:bottom w:val="single" w:sz="6" w:space="1" w:color="000000"/>
-        </w:pBdr>
-        <w:tabs>
-          <w:tab w:val="left" w:pos="900"/>
-        </w:tabs>
-        <w:rPr>
-          <w:rFonts w:ascii="Garamond" w:eastAsia="Garamond" w:hAnsi="Garamond" w:cs="Garamond"/>
-          <w:sz w:val="18"/>
-          <w:szCs w:val="18"/>
-        </w:rPr>
-      </w:pPr>
-      <w:r>
-        <w:rPr>
-          <w:rFonts w:ascii="Garamond" w:eastAsia="Garamond" w:hAnsi="Garamond" w:cs="Garamond"/>
-          <w:sz w:val="18"/>
-          <w:szCs w:val="18"/>
-        </w:rPr>
-        <w:t>AI Engineer with hands-on experience building autonomous LLM-powered agents, fine-tuning foundation models, and deploying ML pipelines for enterprise document intelligence. Proven track record delivering end-to-end automation solutions across Finance and HR domains at GMR Group, including agentic workflows, unstructured data extraction, and real-time analytics. Experienced with the full lifecycle from Solution Design to production deployment using Python, Automation Anywhere, Power BI, and Streamlit. Previously contributed to frontier model optimization at GlobalLogic, including Gemini fine-tuning and Google VEO2.</w:t>
-      </w:r>
-    </w:p>
-    <w:p>
-      <w:pPr>
-        <w:pStyle w:val="Normal1"/>
-        <w:pBdr>
-          <w:bottom w:val="single" w:sz="6" w:space="1" w:color="000000"/>
-        </w:pBdr>
-        <w:tabs>
-          <w:tab w:val="left" w:pos="900"/>
-        </w:tabs>
-        <w:rPr>
-          <w:rFonts w:ascii="Garamond" w:eastAsia="Garamond" w:hAnsi="Garamond" w:cs="Garamond"/>
-          <w:sz w:val="4"/>
-          <w:szCs w:val="4"/>
-        </w:rPr>
-      </w:pPr>
-    </w:p>
-    <w:p>
-      <w:pPr>
-        <w:pStyle w:val="Normal1"/>
-        <w:pBdr>
-          <w:bottom w:val="single" w:sz="6" w:space="1" w:color="000000"/>
-        </w:pBdr>
-        <w:tabs>
-          <w:tab w:val="left" w:pos="900"/>
-        </w:tabs>
-        <w:rPr>
-          <w:rFonts w:ascii="Garamond" w:eastAsia="Garamond" w:hAnsi="Garamond" w:cs="Garamond"/>
-          <w:sz w:val="18"/>
-          <w:szCs w:val="18"/>
-        </w:rPr>
-      </w:pPr>
-      <w:r>
-        <w:rPr>
-          <w:rFonts w:ascii="Garamond" w:eastAsia="Garamond" w:hAnsi="Garamond" w:cs="Garamond"/>
-          <w:b/>
-          <w:color w:val="404040"/>
-          <w:sz w:val="18"/>
-          <w:szCs w:val="18"/>
-        </w:rPr>
-        <w:t>EDUCATION</w:t>
-      </w:r>
-      <w:r>
-        <w:rPr>
-          <w:rFonts w:ascii="Garamond" w:eastAsia="Garamond" w:hAnsi="Garamond" w:cs="Garamond"/>
-          <w:sz w:val="18"/>
-          <w:szCs w:val="18"/>
+          <w:sz w:val="22"/>
+          <w:szCs w:val="22"/>
+        </w:rPr>
+        <w:t>GMR INSTITUTE OF TECHNOLOGY</w:t>
+      </w:r>
+      <w:r>
+        <w:rPr>
+          <w:rFonts w:ascii="Garamond" w:eastAsia="Garamond" w:hAnsi="Garamond" w:cs="Garamond"/>
+          <w:sz w:val="22"/>
+          <w:szCs w:val="22"/>
         </w:rPr>
         <w:tab/>
       </w:r>
-    </w:p>
-    <w:p>
-      <w:pPr>
-        <w:pStyle w:val="Normal1"/>
-        <w:tabs>
-          <w:tab w:val="left" w:pos="900"/>
-        </w:tabs>
-        <w:rPr>
-          <w:rFonts w:ascii="Garamond" w:eastAsia="Garamond" w:hAnsi="Garamond" w:cs="Garamond"/>
-          <w:color w:val="404040"/>
-          <w:sz w:val="4"/>
-          <w:szCs w:val="4"/>
-        </w:rPr>
-      </w:pPr>
-    </w:p>
-    <w:p>
-      <w:pPr>
-        <w:pStyle w:val="Normal1"/>
-        <w:tabs>
-          <w:tab w:val="left" w:pos="900"/>
-        </w:tabs>
-        <w:rPr>
-          <w:rFonts w:ascii="Garamond" w:eastAsia="Garamond" w:hAnsi="Garamond" w:cs="Garamond"/>
-          <w:color w:val="404040"/>
-          <w:sz w:val="4"/>
-          <w:szCs w:val="4"/>
-        </w:rPr>
-      </w:pPr>
+      <w:r>
+        <w:rPr>
+          <w:rFonts w:ascii="Garamond" w:eastAsia="Garamond" w:hAnsi="Garamond" w:cs="Garamond"/>
+          <w:sz w:val="22"/>
+          <w:szCs w:val="22"/>
+        </w:rPr>
+        <w:t>Raz</w:t>
+      </w:r>
+      <w:r>
+        <w:rPr>
+          <w:rFonts w:ascii="Garamond" w:eastAsia="Garamond" w:hAnsi="Garamond" w:cs="Garamond"/>
+          <w:sz w:val="22"/>
+          <w:szCs w:val="22"/>
+        </w:rPr>
+        <w:t>am, IN</w:t>
+      </w:r>
     </w:p>
     <w:p>
       <w:pPr>
@@ -326,105 +378,57 @@
         </w:tabs>
         <w:rPr>
           <w:rFonts w:ascii="Garamond" w:eastAsia="Garamond" w:hAnsi="Garamond" w:cs="Garamond"/>
-          <w:sz w:val="20"/>
-          <w:szCs w:val="20"/>
-        </w:rPr>
-      </w:pPr>
-      <w:r>
-        <w:rPr>
-          <w:rFonts w:ascii="Garamond" w:eastAsia="Garamond" w:hAnsi="Garamond" w:cs="Garamond"/>
-          <w:b/>
           <w:color w:val="404040"/>
-          <w:sz w:val="20"/>
-          <w:szCs w:val="20"/>
-        </w:rPr>
-        <w:t>GMR INSTITUTE OF TECHNOLOGY</w:t>
-      </w:r>
-      <w:r>
-        <w:rPr>
-          <w:rFonts w:ascii="Garamond" w:eastAsia="Garamond" w:hAnsi="Garamond" w:cs="Garamond"/>
-          <w:sz w:val="20"/>
-          <w:szCs w:val="20"/>
+          <w:sz w:val="22"/>
+          <w:szCs w:val="22"/>
+        </w:rPr>
+      </w:pPr>
+      <w:r>
+        <w:rPr>
+          <w:rFonts w:ascii="Garamond" w:eastAsia="Garamond" w:hAnsi="Garamond" w:cs="Garamond"/>
+          <w:color w:val="404040"/>
+          <w:sz w:val="22"/>
+          <w:szCs w:val="22"/>
+        </w:rPr>
+        <w:t>Bachelor of Engineering</w:t>
+      </w:r>
+      <w:r>
+        <w:rPr>
+          <w:rFonts w:ascii="Garamond" w:eastAsia="Garamond" w:hAnsi="Garamond" w:cs="Garamond"/>
+          <w:sz w:val="22"/>
+          <w:szCs w:val="22"/>
         </w:rPr>
         <w:tab/>
       </w:r>
       <w:r>
         <w:rPr>
           <w:rFonts w:ascii="Garamond" w:eastAsia="Garamond" w:hAnsi="Garamond" w:cs="Garamond"/>
-          <w:sz w:val="20"/>
-          <w:szCs w:val="20"/>
-        </w:rPr>
-        <w:t>Raz</w:t>
-      </w:r>
-      <w:r>
-        <w:rPr>
-          <w:rFonts w:ascii="Garamond" w:eastAsia="Garamond" w:hAnsi="Garamond" w:cs="Garamond"/>
-          <w:sz w:val="20"/>
-          <w:szCs w:val="20"/>
-        </w:rPr>
-        <w:t>am, IN</w:t>
-      </w:r>
-    </w:p>
-    <w:p>
-      <w:pPr>
-        <w:pStyle w:val="Normal1"/>
-        <w:tabs>
-          <w:tab w:val="left" w:pos="1134"/>
-          <w:tab w:val="right" w:pos="10503"/>
-        </w:tabs>
-        <w:rPr>
-          <w:rFonts w:ascii="Garamond" w:eastAsia="Garamond" w:hAnsi="Garamond" w:cs="Garamond"/>
-          <w:color w:val="404040"/>
-          <w:sz w:val="20"/>
-          <w:szCs w:val="20"/>
-        </w:rPr>
-      </w:pPr>
-      <w:r>
-        <w:rPr>
-          <w:rFonts w:ascii="Garamond" w:eastAsia="Garamond" w:hAnsi="Garamond" w:cs="Garamond"/>
-          <w:color w:val="404040"/>
-          <w:sz w:val="20"/>
-          <w:szCs w:val="20"/>
-        </w:rPr>
-        <w:t>Bachelor of Engineering</w:t>
-      </w:r>
-      <w:r>
-        <w:rPr>
-          <w:rFonts w:ascii="Garamond" w:eastAsia="Garamond" w:hAnsi="Garamond" w:cs="Garamond"/>
-          <w:sz w:val="20"/>
-          <w:szCs w:val="20"/>
-        </w:rPr>
-        <w:tab/>
-      </w:r>
-      <w:r>
-        <w:rPr>
-          <w:rFonts w:ascii="Garamond" w:eastAsia="Garamond" w:hAnsi="Garamond" w:cs="Garamond"/>
-          <w:sz w:val="20"/>
-          <w:szCs w:val="20"/>
+          <w:sz w:val="22"/>
+          <w:szCs w:val="22"/>
         </w:rPr>
         <w:t>2019 –</w:t>
       </w:r>
       <w:r>
         <w:rPr>
           <w:rFonts w:ascii="Garamond" w:eastAsia="Garamond" w:hAnsi="Garamond" w:cs="Garamond"/>
-          <w:sz w:val="20"/>
-          <w:szCs w:val="20"/>
+          <w:sz w:val="22"/>
+          <w:szCs w:val="22"/>
         </w:rPr>
         <w:t xml:space="preserve"> </w:t>
       </w:r>
       <w:r>
         <w:rPr>
           <w:rFonts w:ascii="Garamond" w:eastAsia="Garamond" w:hAnsi="Garamond" w:cs="Garamond"/>
-          <w:sz w:val="20"/>
-          <w:szCs w:val="20"/>
+          <w:sz w:val="22"/>
+          <w:szCs w:val="22"/>
         </w:rPr>
         <w:t>202</w:t>
       </w:r>
       <w:r>
         <w:rPr>
           <w:rFonts w:ascii="Garamond" w:eastAsia="Garamond" w:hAnsi="Garamond" w:cs="Garamond"/>
-          <w:sz w:val="20"/>
-          <w:szCs w:val="20"/>
+          <w:sz w:val="22"/>
+          <w:szCs w:val="22"/>
         </w:rPr>
         <w:t>3</w:t>
       </w:r>
@@ -447,16 +451,16 @@
         <w:rPr>
           <w:rFonts w:ascii="Garamond" w:eastAsia="Garamond" w:hAnsi="Garamond" w:cs="Garamond"/>
           <w:color w:val="000000"/>
-          <w:sz w:val="20"/>
-          <w:szCs w:val="20"/>
+          <w:sz w:val="22"/>
+          <w:szCs w:val="22"/>
         </w:rPr>
       </w:pPr>
       <w:r>
         <w:rPr>
           <w:rFonts w:ascii="Garamond" w:eastAsia="Garamond" w:hAnsi="Garamond" w:cs="Garamond"/>
           <w:color w:val="000000"/>
-          <w:sz w:val="20"/>
-          <w:szCs w:val="20"/>
+          <w:sz w:val="22"/>
+          <w:szCs w:val="22"/>
         </w:rPr>
         <w:t xml:space="preserve">Major in </w:t>
       </w:r>
@@ -464,8 +468,8 @@
         <w:rPr>
           <w:rFonts w:ascii="Garamond" w:eastAsia="Garamond" w:hAnsi="Garamond" w:cs="Garamond"/>
           <w:color w:val="000000"/>
-          <w:sz w:val="20"/>
-          <w:szCs w:val="20"/>
+          <w:sz w:val="22"/>
+          <w:szCs w:val="22"/>
         </w:rPr>
         <w:t>Information Technology</w:t>
       </w:r>
@@ -479,8 +483,8 @@
         <w:rPr>
           <w:rFonts w:ascii="Garamond" w:eastAsia="Garamond" w:hAnsi="Garamond" w:cs="Garamond"/>
           <w:color w:val="404040"/>
-          <w:sz w:val="4"/>
-          <w:szCs w:val="4"/>
+          <w:sz w:val="6"/>
+          <w:szCs w:val="6"/>
         </w:rPr>
       </w:pPr>
     </w:p>
@@ -495,8 +499,8 @@
         </w:tabs>
         <w:rPr>
           <w:rFonts w:ascii="Garamond" w:eastAsia="Garamond" w:hAnsi="Garamond" w:cs="Garamond"/>
-          <w:sz w:val="20"/>
-          <w:szCs w:val="20"/>
+          <w:sz w:val="22"/>
+          <w:szCs w:val="22"/>
         </w:rPr>
       </w:pPr>
       <w:r>
@@ -504,16 +508,16 @@
           <w:rFonts w:ascii="Garamond" w:eastAsia="Garamond" w:hAnsi="Garamond" w:cs="Garamond"/>
           <w:b/>
           <w:color w:val="404040"/>
-          <w:sz w:val="20"/>
-          <w:szCs w:val="20"/>
+          <w:sz w:val="22"/>
+          <w:szCs w:val="22"/>
         </w:rPr>
         <w:t>WORK EXPERIENCE</w:t>
       </w:r>
       <w:r>
         <w:rPr>
           <w:rFonts w:ascii="Garamond" w:eastAsia="Garamond" w:hAnsi="Garamond" w:cs="Garamond"/>
-          <w:sz w:val="20"/>
-          <w:szCs w:val="20"/>
+          <w:sz w:val="22"/>
+          <w:szCs w:val="22"/>
         </w:rPr>
         <w:tab/>
       </w:r>
@@ -527,8 +531,8 @@
         <w:rPr>
           <w:rFonts w:ascii="Garamond" w:eastAsia="Garamond" w:hAnsi="Garamond" w:cs="Garamond"/>
           <w:color w:val="404040"/>
-          <w:sz w:val="4"/>
-          <w:szCs w:val="4"/>
+          <w:sz w:val="6"/>
+          <w:szCs w:val="6"/>
         </w:rPr>
       </w:pPr>
     </w:p>
@@ -541,8 +545,8 @@
         <w:rPr>
           <w:rFonts w:ascii="Garamond" w:eastAsia="Garamond" w:hAnsi="Garamond" w:cs="Garamond"/>
           <w:color w:val="404040"/>
-          <w:sz w:val="4"/>
-          <w:szCs w:val="4"/>
+          <w:sz w:val="6"/>
+          <w:szCs w:val="6"/>
         </w:rPr>
       </w:pPr>
     </w:p>
@@ -555,8 +559,8 @@
         </w:tabs>
         <w:rPr>
           <w:rFonts w:ascii="Garamond" w:eastAsia="Garamond" w:hAnsi="Garamond" w:cs="Garamond"/>
-          <w:sz w:val="20"/>
-          <w:szCs w:val="20"/>
+          <w:sz w:val="22"/>
+          <w:szCs w:val="22"/>
         </w:rPr>
       </w:pPr>
       <w:r>
@@ -564,8 +568,8 @@
           <w:rFonts w:ascii="Garamond" w:eastAsia="Garamond" w:hAnsi="Garamond" w:cs="Garamond"/>
           <w:b/>
           <w:color w:val="404040"/>
-          <w:sz w:val="20"/>
-          <w:szCs w:val="20"/>
+          <w:sz w:val="22"/>
+          <w:szCs w:val="22"/>
         </w:rPr>
         <w:t>G</w:t>
       </w:r>
@@ -574,16 +578,16 @@
           <w:rFonts w:ascii="Garamond" w:eastAsia="Garamond" w:hAnsi="Garamond" w:cs="Garamond"/>
           <w:b/>
           <w:color w:val="404040"/>
-          <w:sz w:val="20"/>
-          <w:szCs w:val="20"/>
+          <w:sz w:val="22"/>
+          <w:szCs w:val="22"/>
         </w:rPr>
         <w:t>MR GROUP</w:t>
       </w:r>
       <w:r>
         <w:rPr>
           <w:rFonts w:ascii="Garamond" w:eastAsia="Garamond" w:hAnsi="Garamond" w:cs="Garamond"/>
-          <w:sz w:val="20"/>
-          <w:szCs w:val="20"/>
+          <w:sz w:val="22"/>
+          <w:szCs w:val="22"/>
         </w:rPr>
         <w:tab/>
         <w:t>Hyderabad, IN</w:t>
@@ -598,31 +602,31 @@
         </w:tabs>
         <w:rPr>
           <w:rFonts w:ascii="Garamond" w:eastAsia="Garamond" w:hAnsi="Garamond" w:cs="Garamond"/>
-          <w:sz w:val="20"/>
-          <w:szCs w:val="20"/>
-        </w:rPr>
-      </w:pPr>
-      <w:r>
-        <w:rPr>
-          <w:rFonts w:ascii="Garamond" w:eastAsia="Garamond" w:hAnsi="Garamond" w:cs="Garamond"/>
-          <w:sz w:val="20"/>
-          <w:szCs w:val="20"/>
+          <w:sz w:val="22"/>
+          <w:szCs w:val="22"/>
+        </w:rPr>
+      </w:pPr>
+      <w:r>
+        <w:rPr>
+          <w:rFonts w:ascii="Garamond" w:eastAsia="Garamond" w:hAnsi="Garamond" w:cs="Garamond"/>
+          <w:sz w:val="22"/>
+          <w:szCs w:val="22"/>
         </w:rPr>
         <w:t xml:space="preserve">Artificial Intelligence </w:t>
       </w:r>
       <w:r>
         <w:rPr>
           <w:rFonts w:ascii="Garamond" w:eastAsia="Garamond" w:hAnsi="Garamond" w:cs="Garamond"/>
-          <w:sz w:val="20"/>
-          <w:szCs w:val="20"/>
+          <w:sz w:val="22"/>
+          <w:szCs w:val="22"/>
         </w:rPr>
         <w:t>Engineer</w:t>
       </w:r>
       <w:r>
         <w:rPr>
           <w:rFonts w:ascii="Garamond" w:eastAsia="Garamond" w:hAnsi="Garamond" w:cs="Garamond"/>
-          <w:sz w:val="20"/>
-          <w:szCs w:val="20"/>
+          <w:sz w:val="22"/>
+          <w:szCs w:val="22"/>
         </w:rPr>
         <w:tab/>
         <w:t>2025</w:t>
@@ -633,7 +637,7 @@
         <w:pStyle w:val="Normal1"/>
         <w:numPr>
           <w:ilvl w:val="0"/>
-          <w:numId w:val="16"/>
+          <w:numId w:val="18"/>
         </w:numPr>
         <w:tabs>
           <w:tab w:val="left" w:pos="1134"/>
@@ -641,28 +645,19 @@
         </w:tabs>
         <w:rPr>
           <w:rFonts w:ascii="Garamond" w:eastAsia="Garamond" w:hAnsi="Garamond" w:cs="Garamond"/>
-          <w:sz w:val="20"/>
-          <w:szCs w:val="20"/>
+          <w:sz w:val="22"/>
+          <w:szCs w:val="22"/>
           <w:lang w:val="en-IN"/>
         </w:rPr>
       </w:pPr>
       <w:r>
         <w:rPr>
           <w:rFonts w:ascii="Garamond" w:eastAsia="Garamond" w:hAnsi="Garamond" w:cs="Garamond"/>
-          <w:sz w:val="20"/>
-          <w:szCs w:val="20"/>
+          <w:sz w:val="22"/>
+          <w:szCs w:val="22"/>
           <w:lang w:val="en-IN"/>
         </w:rPr>
-        <w:t>Architected and deployed an autonomous AI Newsletter Agent that continuously scrapes real-time data on emerging AI models, global regulations, and industry tools — delivering curated intelligence directly to the Learning &amp; Development team and eliminating hours of manual research weekly.</w:t>
-      </w:r>
-      <w:r>
-        <w:rPr>
-          <w:rFonts w:ascii="Garamond" w:eastAsia="Garamond" w:hAnsi="Garamond" w:cs="Garamond"/>
-          <w:sz w:val="20"/>
-          <w:szCs w:val="20"/>
-          <w:lang w:val="en-IN"/>
-        </w:rPr>
-        <w:t xml:space="preserve"> </w:t>
+        <w:t>Architected and deployed an autonomous AI Newsletter Agent leveraging LLM-powered Retrieval-Augmented Generation (RAG), agentic workflows, and knowledge orchestration frameworks to continuously scrape and synthesize real-time intelligence on emerging AI models, global regulations, and industry tools, delivering curated insights and eliminating hours of manual research weekly.</w:t>
       </w:r>
     </w:p>
     <w:p>
@@ -670,7 +665,7 @@
         <w:pStyle w:val="Normal1"/>
         <w:numPr>
           <w:ilvl w:val="0"/>
-          <w:numId w:val="16"/>
+          <w:numId w:val="18"/>
         </w:numPr>
         <w:tabs>
           <w:tab w:val="left" w:pos="1134"/>
@@ -678,19 +673,19 @@
         </w:tabs>
         <w:rPr>
           <w:rFonts w:ascii="Garamond" w:eastAsia="Garamond" w:hAnsi="Garamond" w:cs="Garamond"/>
-          <w:sz w:val="20"/>
-          <w:szCs w:val="20"/>
+          <w:sz w:val="22"/>
+          <w:szCs w:val="22"/>
           <w:lang w:val="en-IN"/>
         </w:rPr>
       </w:pPr>
       <w:r>
         <w:rPr>
           <w:rFonts w:ascii="Garamond" w:eastAsia="Garamond" w:hAnsi="Garamond" w:cs="Garamond"/>
-          <w:sz w:val="20"/>
-          <w:szCs w:val="20"/>
+          <w:sz w:val="22"/>
+          <w:szCs w:val="22"/>
           <w:lang w:val="en-IN"/>
         </w:rPr>
-        <w:t>Designed and trained a Machine Learning model to classify and extract structured data from diverse unstructured payment advice formats, fully automating a previously manual Finance data entry process and improving extraction accuracy across multiple document layouts.</w:t>
+        <w:t>Designed and trained a Machine Learning model with integrated OCR (Optical Character Recognition) and NLP pipelines to classify and extract structured data from diverse unstructured payment advice formats, fully automating Finance data entry and improving accuracy across multiple document layouts.</w:t>
       </w:r>
     </w:p>
     <w:p>
@@ -698,7 +693,7 @@
         <w:pStyle w:val="Normal1"/>
         <w:numPr>
           <w:ilvl w:val="0"/>
-          <w:numId w:val="16"/>
+          <w:numId w:val="18"/>
         </w:numPr>
         <w:tabs>
           <w:tab w:val="left" w:pos="1134"/>
@@ -706,39 +701,39 @@
         </w:tabs>
         <w:rPr>
           <w:rFonts w:ascii="Garamond" w:eastAsia="Garamond" w:hAnsi="Garamond" w:cs="Garamond"/>
-          <w:sz w:val="20"/>
-          <w:szCs w:val="20"/>
+          <w:sz w:val="22"/>
+          <w:szCs w:val="22"/>
           <w:lang w:val="en-IN"/>
         </w:rPr>
       </w:pPr>
       <w:r>
         <w:rPr>
           <w:rFonts w:ascii="Garamond" w:eastAsia="Garamond" w:hAnsi="Garamond" w:cs="Garamond"/>
-          <w:sz w:val="20"/>
-          <w:szCs w:val="20"/>
+          <w:sz w:val="22"/>
+          <w:szCs w:val="22"/>
           <w:lang w:val="en-IN"/>
         </w:rPr>
-        <w:t xml:space="preserve">Optimized the end-to-end Cash Application (CashApp) process by embedding automated extraction logic into invoice processing workflows, significantly reducing manual reconciliation </w:t>
-      </w:r>
-      <w:proofErr w:type="gramStart"/>
-      <w:r>
-        <w:rPr>
-          <w:rFonts w:ascii="Garamond" w:eastAsia="Garamond" w:hAnsi="Garamond" w:cs="Garamond"/>
-          <w:sz w:val="20"/>
-          <w:szCs w:val="20"/>
+        <w:t>Optimized the end-to-end Cash Application (</w:t>
+      </w:r>
+      <w:proofErr w:type="spellStart"/>
+      <w:r>
+        <w:rPr>
+          <w:rFonts w:ascii="Garamond" w:eastAsia="Garamond" w:hAnsi="Garamond" w:cs="Garamond"/>
+          <w:sz w:val="22"/>
+          <w:szCs w:val="22"/>
           <w:lang w:val="en-IN"/>
         </w:rPr>
-        <w:t>cycles</w:t>
-      </w:r>
-      <w:proofErr w:type="gramEnd"/>
-      <w:r>
-        <w:rPr>
-          <w:rFonts w:ascii="Garamond" w:eastAsia="Garamond" w:hAnsi="Garamond" w:cs="Garamond"/>
-          <w:sz w:val="20"/>
-          <w:szCs w:val="20"/>
+        <w:t>CashApp</w:t>
+      </w:r>
+      <w:proofErr w:type="spellEnd"/>
+      <w:r>
+        <w:rPr>
+          <w:rFonts w:ascii="Garamond" w:eastAsia="Garamond" w:hAnsi="Garamond" w:cs="Garamond"/>
+          <w:sz w:val="22"/>
+          <w:szCs w:val="22"/>
           <w:lang w:val="en-IN"/>
         </w:rPr>
-        <w:t xml:space="preserve"> and improving financial data accuracy at scale.</w:t>
+        <w:t>) workflow by embedding AI-driven extraction logic, OCR engines, and agent orchestration into invoice processing pipelines, significantly reducing manual reconciliation cycles and improving financial data accuracy at scale.</w:t>
       </w:r>
     </w:p>
     <w:p>
@@ -746,7 +741,7 @@
         <w:pStyle w:val="Normal1"/>
         <w:numPr>
           <w:ilvl w:val="0"/>
-          <w:numId w:val="16"/>
+          <w:numId w:val="18"/>
         </w:numPr>
         <w:tabs>
           <w:tab w:val="left" w:pos="1134"/>
@@ -754,18 +749,19 @@
         </w:tabs>
         <w:rPr>
           <w:rFonts w:ascii="Garamond" w:eastAsia="Garamond" w:hAnsi="Garamond" w:cs="Garamond"/>
-          <w:sz w:val="20"/>
-          <w:szCs w:val="20"/>
+          <w:sz w:val="22"/>
+          <w:szCs w:val="22"/>
           <w:lang w:val="en-IN"/>
         </w:rPr>
       </w:pPr>
       <w:r>
         <w:rPr>
           <w:rFonts w:ascii="Garamond" w:eastAsia="Garamond" w:hAnsi="Garamond" w:cs="Garamond"/>
-          <w:sz w:val="20"/>
-          <w:szCs w:val="20"/>
-        </w:rPr>
-        <w:t>Authored detailed Process Definition Documents (PDD) and Solution Design Documents (SDD) for multiple automation initiatives, bridging business requirements and technical architecture to ensure scalable, maintainable implementations.</w:t>
+          <w:sz w:val="22"/>
+          <w:szCs w:val="22"/>
+          <w:lang w:val="en-IN"/>
+        </w:rPr>
+        <w:t>Authored Process Definition Documents (PDD) and Solution Design Documents (SDD) to translate business requirements into scalable technical architectures, ensuring maintainable implementations of AI agents, RPA bots, ML models, and OCR-based automation solutions.</w:t>
       </w:r>
     </w:p>
     <w:p>
@@ -773,7 +769,7 @@
         <w:pStyle w:val="Normal1"/>
         <w:numPr>
           <w:ilvl w:val="0"/>
-          <w:numId w:val="16"/>
+          <w:numId w:val="18"/>
         </w:numPr>
         <w:tabs>
           <w:tab w:val="left" w:pos="1134"/>
@@ -781,18 +777,39 @@
         </w:tabs>
         <w:rPr>
           <w:rFonts w:ascii="Garamond" w:eastAsia="Garamond" w:hAnsi="Garamond" w:cs="Garamond"/>
-          <w:sz w:val="20"/>
-          <w:szCs w:val="20"/>
+          <w:sz w:val="22"/>
+          <w:szCs w:val="22"/>
           <w:lang w:val="en-IN"/>
         </w:rPr>
       </w:pPr>
       <w:r>
         <w:rPr>
           <w:rFonts w:ascii="Garamond" w:eastAsia="Garamond" w:hAnsi="Garamond" w:cs="Garamond"/>
-          <w:sz w:val="20"/>
-          <w:szCs w:val="20"/>
-        </w:rPr>
-        <w:t>Built a Python and Streamlit-based Trial Balance Analyzer integrated with Automation Anywhere, replacing a manual accounting review process with an automated data processing pipeline that accelerates financial reporting.</w:t>
+          <w:sz w:val="22"/>
+          <w:szCs w:val="22"/>
+          <w:lang w:val="en-IN"/>
+        </w:rPr>
+        <w:t xml:space="preserve">Built a Python + </w:t>
+      </w:r>
+      <w:proofErr w:type="spellStart"/>
+      <w:r>
+        <w:rPr>
+          <w:rFonts w:ascii="Garamond" w:eastAsia="Garamond" w:hAnsi="Garamond" w:cs="Garamond"/>
+          <w:sz w:val="22"/>
+          <w:szCs w:val="22"/>
+          <w:lang w:val="en-IN"/>
+        </w:rPr>
+        <w:t>Streamlit</w:t>
+      </w:r>
+      <w:proofErr w:type="spellEnd"/>
+      <w:r>
+        <w:rPr>
+          <w:rFonts w:ascii="Garamond" w:eastAsia="Garamond" w:hAnsi="Garamond" w:cs="Garamond"/>
+          <w:sz w:val="22"/>
+          <w:szCs w:val="22"/>
+          <w:lang w:val="en-IN"/>
+        </w:rPr>
+        <w:t>-based Trial Balance Analyzer integrated with Automation Anywhere, orchestrating automated data pipelines that replaced manual accounting reviews and accelerated financial reporting workflows.</w:t>
       </w:r>
     </w:p>
     <w:p>
@@ -800,7 +817,7 @@
         <w:pStyle w:val="Normal1"/>
         <w:numPr>
           <w:ilvl w:val="0"/>
-          <w:numId w:val="16"/>
+          <w:numId w:val="18"/>
         </w:numPr>
         <w:tabs>
           <w:tab w:val="left" w:pos="1134"/>
@@ -808,18 +825,19 @@
         </w:tabs>
         <w:rPr>
           <w:rFonts w:ascii="Garamond" w:eastAsia="Garamond" w:hAnsi="Garamond" w:cs="Garamond"/>
-          <w:sz w:val="20"/>
-          <w:szCs w:val="20"/>
+          <w:sz w:val="22"/>
+          <w:szCs w:val="22"/>
           <w:lang w:val="en-IN"/>
         </w:rPr>
       </w:pPr>
       <w:r>
         <w:rPr>
           <w:rFonts w:ascii="Garamond" w:eastAsia="Garamond" w:hAnsi="Garamond" w:cs="Garamond"/>
-          <w:sz w:val="20"/>
-          <w:szCs w:val="20"/>
-        </w:rPr>
-        <w:t>Designed and maintained a Power BI dashboard for HR analytics, integrating live SAP data with automated daily refresh cycles — enabling real-time workforce insights for HR leadership without manual intervention.</w:t>
+          <w:sz w:val="22"/>
+          <w:szCs w:val="22"/>
+          <w:lang w:val="en-IN"/>
+        </w:rPr>
+        <w:t>Designed and maintained a Power BI dashboard for HR analytics, integrating live SAP data with automated refresh cycles, enabling real-time workforce insights through data engineering, ETL pipelines, and visualization frameworks.</w:t>
       </w:r>
     </w:p>
     <w:p>
@@ -827,7 +845,7 @@
         <w:pStyle w:val="Normal1"/>
         <w:numPr>
           <w:ilvl w:val="0"/>
-          <w:numId w:val="16"/>
+          <w:numId w:val="18"/>
         </w:numPr>
         <w:tabs>
           <w:tab w:val="left" w:pos="1134"/>
@@ -835,19 +853,19 @@
         </w:tabs>
         <w:rPr>
           <w:rFonts w:ascii="Garamond" w:eastAsia="Garamond" w:hAnsi="Garamond" w:cs="Garamond"/>
-          <w:sz w:val="20"/>
-          <w:szCs w:val="20"/>
+          <w:sz w:val="22"/>
+          <w:szCs w:val="22"/>
           <w:lang w:val="en-IN"/>
         </w:rPr>
       </w:pPr>
       <w:r>
         <w:rPr>
           <w:rFonts w:ascii="Garamond" w:eastAsia="Garamond" w:hAnsi="Garamond" w:cs="Garamond"/>
-          <w:sz w:val="20"/>
-          <w:szCs w:val="20"/>
+          <w:sz w:val="22"/>
+          <w:szCs w:val="22"/>
           <w:lang w:val="en-IN"/>
         </w:rPr>
-        <w:t>Conducted in-depth performance log analysis across deployed bots, identifying inefficiencies and implementing data-driven optimizations that improved overall bot execution reliability and throughput.</w:t>
+        <w:t>Conducted advanced performance log analysis across deployed bots and AI agents, identifying inefficiencies and implementing data-driven optimizations that improved execution reliability, throughput, and overall system resilience.</w:t>
       </w:r>
     </w:p>
     <w:p>
@@ -857,11 +875,10 @@
           <w:tab w:val="left" w:pos="1134"/>
           <w:tab w:val="right" w:pos="10503"/>
         </w:tabs>
-        <w:ind w:left="720"/>
-        <w:rPr>
-          <w:rFonts w:ascii="Garamond" w:eastAsia="Garamond" w:hAnsi="Garamond" w:cs="Garamond"/>
-          <w:sz w:val="20"/>
-          <w:szCs w:val="20"/>
+        <w:rPr>
+          <w:rFonts w:ascii="Garamond" w:eastAsia="Garamond" w:hAnsi="Garamond" w:cs="Garamond"/>
+          <w:sz w:val="22"/>
+          <w:szCs w:val="22"/>
           <w:lang w:val="en-IN"/>
         </w:rPr>
       </w:pPr>
@@ -875,8 +892,8 @@
         </w:tabs>
         <w:rPr>
           <w:rFonts w:ascii="Garamond" w:eastAsia="Garamond" w:hAnsi="Garamond" w:cs="Garamond"/>
-          <w:sz w:val="20"/>
-          <w:szCs w:val="20"/>
+          <w:sz w:val="22"/>
+          <w:szCs w:val="22"/>
         </w:rPr>
       </w:pPr>
       <w:r>
@@ -884,8 +901,8 @@
           <w:rFonts w:ascii="Garamond" w:eastAsia="Garamond" w:hAnsi="Garamond" w:cs="Garamond"/>
           <w:b/>
           <w:color w:val="404040"/>
-          <w:sz w:val="20"/>
-          <w:szCs w:val="20"/>
+          <w:sz w:val="22"/>
+          <w:szCs w:val="22"/>
         </w:rPr>
         <w:t>G</w:t>
       </w:r>
@@ -894,16 +911,16 @@
           <w:rFonts w:ascii="Garamond" w:eastAsia="Garamond" w:hAnsi="Garamond" w:cs="Garamond"/>
           <w:b/>
           <w:color w:val="404040"/>
-          <w:sz w:val="20"/>
-          <w:szCs w:val="20"/>
+          <w:sz w:val="22"/>
+          <w:szCs w:val="22"/>
         </w:rPr>
         <w:t>LOBAL LOGIC</w:t>
       </w:r>
       <w:r>
         <w:rPr>
           <w:rFonts w:ascii="Garamond" w:eastAsia="Garamond" w:hAnsi="Garamond" w:cs="Garamond"/>
-          <w:sz w:val="20"/>
-          <w:szCs w:val="20"/>
+          <w:sz w:val="22"/>
+          <w:szCs w:val="22"/>
         </w:rPr>
         <w:tab/>
         <w:t>Hyderabad</w:t>
@@ -911,24 +928,24 @@
       <w:r>
         <w:rPr>
           <w:rFonts w:ascii="Garamond" w:eastAsia="Garamond" w:hAnsi="Garamond" w:cs="Garamond"/>
-          <w:sz w:val="20"/>
-          <w:szCs w:val="20"/>
+          <w:sz w:val="22"/>
+          <w:szCs w:val="22"/>
         </w:rPr>
         <w:t xml:space="preserve">, </w:t>
       </w:r>
       <w:r>
         <w:rPr>
           <w:rFonts w:ascii="Garamond" w:eastAsia="Garamond" w:hAnsi="Garamond" w:cs="Garamond"/>
-          <w:sz w:val="20"/>
-          <w:szCs w:val="20"/>
+          <w:sz w:val="22"/>
+          <w:szCs w:val="22"/>
         </w:rPr>
         <w:t>I</w:t>
       </w:r>
       <w:r>
         <w:rPr>
           <w:rFonts w:ascii="Garamond" w:eastAsia="Garamond" w:hAnsi="Garamond" w:cs="Garamond"/>
-          <w:sz w:val="20"/>
-          <w:szCs w:val="20"/>
+          <w:sz w:val="22"/>
+          <w:szCs w:val="22"/>
         </w:rPr>
         <w:t>N</w:t>
       </w:r>
@@ -942,31 +959,31 @@
         </w:tabs>
         <w:rPr>
           <w:rFonts w:ascii="Garamond" w:eastAsia="Garamond" w:hAnsi="Garamond" w:cs="Garamond"/>
-          <w:sz w:val="20"/>
-          <w:szCs w:val="20"/>
-        </w:rPr>
-      </w:pPr>
-      <w:r>
-        <w:rPr>
-          <w:rFonts w:ascii="Garamond" w:eastAsia="Garamond" w:hAnsi="Garamond" w:cs="Garamond"/>
-          <w:sz w:val="20"/>
-          <w:szCs w:val="20"/>
+          <w:sz w:val="22"/>
+          <w:szCs w:val="22"/>
+        </w:rPr>
+      </w:pPr>
+      <w:r>
+        <w:rPr>
+          <w:rFonts w:ascii="Garamond" w:eastAsia="Garamond" w:hAnsi="Garamond" w:cs="Garamond"/>
+          <w:sz w:val="22"/>
+          <w:szCs w:val="22"/>
         </w:rPr>
         <w:t xml:space="preserve">Associate Analyst </w:t>
       </w:r>
       <w:r>
         <w:rPr>
           <w:rFonts w:ascii="Garamond" w:eastAsia="Garamond" w:hAnsi="Garamond" w:cs="Garamond"/>
-          <w:sz w:val="20"/>
-          <w:szCs w:val="20"/>
+          <w:sz w:val="22"/>
+          <w:szCs w:val="22"/>
         </w:rPr>
         <w:tab/>
       </w:r>
       <w:r>
         <w:rPr>
           <w:rFonts w:ascii="Garamond" w:eastAsia="Garamond" w:hAnsi="Garamond" w:cs="Garamond"/>
-          <w:sz w:val="20"/>
-          <w:szCs w:val="20"/>
+          <w:sz w:val="22"/>
+          <w:szCs w:val="22"/>
         </w:rPr>
         <w:t>2024</w:t>
       </w:r>
@@ -976,21 +993,23 @@
         <w:pStyle w:val="ListParagraph"/>
         <w:numPr>
           <w:ilvl w:val="0"/>
-          <w:numId w:val="13"/>
+          <w:numId w:val="20"/>
         </w:numPr>
         <w:rPr>
           <w:rFonts w:ascii="Garamond" w:eastAsia="Garamond" w:hAnsi="Garamond" w:cs="Garamond"/>
-          <w:sz w:val="20"/>
-          <w:szCs w:val="20"/>
-        </w:rPr>
-      </w:pPr>
-      <w:r>
-        <w:rPr>
-          <w:rFonts w:ascii="Garamond" w:eastAsia="Garamond" w:hAnsi="Garamond" w:cs="Garamond"/>
-          <w:sz w:val="20"/>
-          <w:szCs w:val="20"/>
-        </w:rPr>
-        <w:t>Fine-tuned Gemini large language models on domain-specific datasets to generate policy-compliant content, improving output safety and relevance for Google's content moderation workflows.</w:t>
+          <w:sz w:val="22"/>
+          <w:szCs w:val="22"/>
+          <w:lang w:val="en-IN"/>
+        </w:rPr>
+      </w:pPr>
+      <w:r>
+        <w:rPr>
+          <w:rFonts w:ascii="Garamond" w:eastAsia="Garamond" w:hAnsi="Garamond" w:cs="Garamond"/>
+          <w:sz w:val="22"/>
+          <w:szCs w:val="22"/>
+          <w:lang w:val="en-IN"/>
+        </w:rPr>
+        <w:t>Fine-tuned Gemini Large Language Models (LLMs) on domain-specific datasets using retrieval-augmented generation (RAG) and prompt engineering strategies, enabling policy-compliant content generation that improved output safety, relevance, and alignment with Google’s content moderation workflows.</w:t>
       </w:r>
     </w:p>
     <w:p>
@@ -998,21 +1017,23 @@
         <w:pStyle w:val="ListParagraph"/>
         <w:numPr>
           <w:ilvl w:val="0"/>
-          <w:numId w:val="13"/>
+          <w:numId w:val="20"/>
         </w:numPr>
         <w:rPr>
           <w:rFonts w:ascii="Garamond" w:eastAsia="Garamond" w:hAnsi="Garamond" w:cs="Garamond"/>
-          <w:sz w:val="20"/>
-          <w:szCs w:val="20"/>
-        </w:rPr>
-      </w:pPr>
-      <w:r>
-        <w:rPr>
-          <w:rFonts w:ascii="Garamond" w:eastAsia="Garamond" w:hAnsi="Garamond" w:cs="Garamond"/>
-          <w:sz w:val="20"/>
-          <w:szCs w:val="20"/>
-        </w:rPr>
-        <w:t>Developed and validated image recognition models for Google Face Next, enhancing multi-class categorization accuracy and advancing safety classification performance across large-scale visual datasets.</w:t>
+          <w:sz w:val="22"/>
+          <w:szCs w:val="22"/>
+          <w:lang w:val="en-IN"/>
+        </w:rPr>
+      </w:pPr>
+      <w:r>
+        <w:rPr>
+          <w:rFonts w:ascii="Garamond" w:eastAsia="Garamond" w:hAnsi="Garamond" w:cs="Garamond"/>
+          <w:sz w:val="22"/>
+          <w:szCs w:val="22"/>
+          <w:lang w:val="en-IN"/>
+        </w:rPr>
+        <w:t>Developed and validated advanced image recognition models leveraging computer vision, OCR pipelines, and deep learning architectures for Google Face Next, enhancing multi-class categorization accuracy and advancing safety classification performance across large-scale visual datasets.</w:t>
       </w:r>
     </w:p>
     <w:p>
@@ -1020,21 +1041,23 @@
         <w:pStyle w:val="ListParagraph"/>
         <w:numPr>
           <w:ilvl w:val="0"/>
-          <w:numId w:val="13"/>
+          <w:numId w:val="20"/>
         </w:numPr>
         <w:rPr>
           <w:rFonts w:ascii="Garamond" w:eastAsia="Garamond" w:hAnsi="Garamond" w:cs="Garamond"/>
-          <w:sz w:val="20"/>
-          <w:szCs w:val="20"/>
-        </w:rPr>
-      </w:pPr>
-      <w:r>
-        <w:rPr>
-          <w:rFonts w:ascii="Garamond" w:eastAsia="Garamond" w:hAnsi="Garamond" w:cs="Garamond"/>
-          <w:sz w:val="20"/>
-          <w:szCs w:val="20"/>
-        </w:rPr>
-        <w:t>Contributed to the optimization of Google's VEO2 marketing product by refining prompt engineering strategies and streamlining the prompt-to-multimedia generation pipeline, improving output quality and generation consistency.</w:t>
+          <w:sz w:val="22"/>
+          <w:szCs w:val="22"/>
+          <w:lang w:val="en-IN"/>
+        </w:rPr>
+      </w:pPr>
+      <w:r>
+        <w:rPr>
+          <w:rFonts w:ascii="Garamond" w:eastAsia="Garamond" w:hAnsi="Garamond" w:cs="Garamond"/>
+          <w:sz w:val="22"/>
+          <w:szCs w:val="22"/>
+          <w:lang w:val="en-IN"/>
+        </w:rPr>
+        <w:t>Contributed to the optimization of Google’s VEO2 marketing product by refining prompt engineering techniques, orchestrating agentic workflows, and streamlining the prompt-to-multimedia generation pipeline, resulting in improved output quality, consistency, and scalability of generative AI systems.</w:t>
       </w:r>
     </w:p>
     <w:p>
@@ -1042,8 +1065,8 @@
         <w:pStyle w:val="ListParagraph"/>
         <w:rPr>
           <w:rFonts w:ascii="Garamond" w:eastAsia="Garamond" w:hAnsi="Garamond" w:cs="Garamond"/>
-          <w:sz w:val="6"/>
-          <w:szCs w:val="6"/>
+          <w:sz w:val="8"/>
+          <w:szCs w:val="8"/>
         </w:rPr>
       </w:pPr>
     </w:p>
@@ -1058,26 +1081,117 @@
         </w:tabs>
         <w:rPr>
           <w:rFonts w:ascii="Garamond" w:eastAsia="Garamond" w:hAnsi="Garamond" w:cs="Garamond"/>
-          <w:color w:val="404040"/>
-          <w:sz w:val="4"/>
-          <w:szCs w:val="4"/>
-        </w:rPr>
-      </w:pPr>
-      <w:r>
-        <w:rPr>
-          <w:rFonts w:ascii="Garamond" w:eastAsia="Garamond" w:hAnsi="Garamond" w:cs="Garamond"/>
           <w:b/>
           <w:color w:val="404040"/>
-          <w:sz w:val="20"/>
-          <w:szCs w:val="20"/>
-        </w:rPr>
+          <w:sz w:val="22"/>
+          <w:szCs w:val="22"/>
+        </w:rPr>
+      </w:pPr>
+    </w:p>
+    <w:p>
+      <w:pPr>
+        <w:pStyle w:val="Normal1"/>
+        <w:pBdr>
+          <w:bottom w:val="single" w:sz="6" w:space="1" w:color="000000"/>
+        </w:pBdr>
+        <w:tabs>
+          <w:tab w:val="left" w:pos="900"/>
+        </w:tabs>
+        <w:rPr>
+          <w:rFonts w:ascii="Garamond" w:eastAsia="Garamond" w:hAnsi="Garamond" w:cs="Garamond"/>
+          <w:b/>
+          <w:color w:val="404040"/>
+          <w:sz w:val="22"/>
+          <w:szCs w:val="22"/>
+        </w:rPr>
+      </w:pPr>
+    </w:p>
+    <w:p>
+      <w:pPr>
+        <w:pStyle w:val="Normal1"/>
+        <w:pBdr>
+          <w:bottom w:val="single" w:sz="6" w:space="1" w:color="000000"/>
+        </w:pBdr>
+        <w:tabs>
+          <w:tab w:val="left" w:pos="900"/>
+        </w:tabs>
+        <w:rPr>
+          <w:rFonts w:ascii="Garamond" w:eastAsia="Garamond" w:hAnsi="Garamond" w:cs="Garamond"/>
+          <w:b/>
+          <w:color w:val="404040"/>
+          <w:sz w:val="22"/>
+          <w:szCs w:val="22"/>
+        </w:rPr>
+      </w:pPr>
+    </w:p>
+    <w:p>
+      <w:pPr>
+        <w:pStyle w:val="Normal1"/>
+        <w:pBdr>
+          <w:bottom w:val="single" w:sz="6" w:space="1" w:color="000000"/>
+        </w:pBdr>
+        <w:tabs>
+          <w:tab w:val="left" w:pos="900"/>
+        </w:tabs>
+        <w:rPr>
+          <w:rFonts w:ascii="Garamond" w:eastAsia="Garamond" w:hAnsi="Garamond" w:cs="Garamond"/>
+          <w:b/>
+          <w:color w:val="404040"/>
+          <w:sz w:val="22"/>
+          <w:szCs w:val="22"/>
+        </w:rPr>
+      </w:pPr>
+    </w:p>
+    <w:p>
+      <w:pPr>
+        <w:pStyle w:val="Normal1"/>
+        <w:pBdr>
+          <w:bottom w:val="single" w:sz="6" w:space="1" w:color="000000"/>
+        </w:pBdr>
+        <w:tabs>
+          <w:tab w:val="left" w:pos="900"/>
+        </w:tabs>
+        <w:rPr>
+          <w:rFonts w:ascii="Garamond" w:eastAsia="Garamond" w:hAnsi="Garamond" w:cs="Garamond"/>
+          <w:b/>
+          <w:color w:val="404040"/>
+          <w:sz w:val="22"/>
+          <w:szCs w:val="22"/>
+        </w:rPr>
+      </w:pPr>
+    </w:p>
+    <w:p>
+      <w:pPr>
+        <w:pStyle w:val="Normal1"/>
+        <w:pBdr>
+          <w:bottom w:val="single" w:sz="6" w:space="1" w:color="000000"/>
+        </w:pBdr>
+        <w:tabs>
+          <w:tab w:val="left" w:pos="900"/>
+        </w:tabs>
+        <w:rPr>
+          <w:rFonts w:ascii="Garamond" w:eastAsia="Garamond" w:hAnsi="Garamond" w:cs="Garamond"/>
+          <w:color w:val="404040"/>
+          <w:sz w:val="6"/>
+          <w:szCs w:val="6"/>
+        </w:rPr>
+      </w:pPr>
+      <w:r>
+        <w:rPr>
+          <w:rFonts w:ascii="Garamond" w:eastAsia="Garamond" w:hAnsi="Garamond" w:cs="Garamond"/>
+          <w:b/>
+          <w:color w:val="404040"/>
+          <w:sz w:val="22"/>
+          <w:szCs w:val="22"/>
+        </w:rPr>
+        <w:lastRenderedPageBreak/>
         <w:t>UNIVERSITY PROJECTS</w:t>
       </w:r>
       <w:r>
         <w:rPr>
           <w:rFonts w:ascii="Garamond" w:eastAsia="Garamond" w:hAnsi="Garamond" w:cs="Garamond"/>
-          <w:sz w:val="20"/>
-          <w:szCs w:val="20"/>
+          <w:sz w:val="22"/>
+          <w:szCs w:val="22"/>
         </w:rPr>
         <w:tab/>
       </w:r>
@@ -1091,16 +1205,16 @@
         <w:rPr>
           <w:rFonts w:ascii="Garamond" w:eastAsia="Garamond" w:hAnsi="Garamond" w:cs="Garamond"/>
           <w:b/>
-          <w:sz w:val="20"/>
-          <w:szCs w:val="20"/>
+          <w:sz w:val="22"/>
+          <w:szCs w:val="22"/>
         </w:rPr>
       </w:pPr>
       <w:r>
         <w:rPr>
           <w:rFonts w:ascii="Garamond" w:eastAsia="Garamond" w:hAnsi="Garamond" w:cs="Garamond"/>
           <w:b/>
-          <w:sz w:val="20"/>
-          <w:szCs w:val="20"/>
+          <w:sz w:val="22"/>
+          <w:szCs w:val="22"/>
         </w:rPr>
         <w:t>FOREST FIRE DETECTION USING DATA MINING</w:t>
       </w:r>
@@ -1118,16 +1232,16 @@
         <w:rPr>
           <w:rFonts w:ascii="Garamond" w:eastAsia="Garamond" w:hAnsi="Garamond" w:cs="Garamond"/>
           <w:bCs/>
-          <w:sz w:val="20"/>
-          <w:szCs w:val="20"/>
+          <w:sz w:val="22"/>
+          <w:szCs w:val="22"/>
         </w:rPr>
       </w:pPr>
       <w:r>
         <w:rPr>
           <w:rFonts w:ascii="Garamond" w:eastAsia="Garamond" w:hAnsi="Garamond" w:cs="Garamond"/>
           <w:bCs/>
-          <w:sz w:val="20"/>
-          <w:szCs w:val="20"/>
+          <w:sz w:val="22"/>
+          <w:szCs w:val="22"/>
         </w:rPr>
         <w:t>Developed a predictive detection system using historical and real-time environmental datasets to identify early-stage forest fire conditions with improved temporal accuracy.</w:t>
       </w:r>
@@ -1145,16 +1259,16 @@
         <w:rPr>
           <w:rFonts w:ascii="Garamond" w:eastAsia="Garamond" w:hAnsi="Garamond" w:cs="Garamond"/>
           <w:bCs/>
-          <w:sz w:val="20"/>
-          <w:szCs w:val="20"/>
+          <w:sz w:val="22"/>
+          <w:szCs w:val="22"/>
         </w:rPr>
       </w:pPr>
       <w:r>
         <w:rPr>
           <w:rFonts w:ascii="Garamond" w:eastAsia="Garamond" w:hAnsi="Garamond" w:cs="Garamond"/>
           <w:bCs/>
-          <w:sz w:val="20"/>
-          <w:szCs w:val="20"/>
+          <w:sz w:val="22"/>
+          <w:szCs w:val="22"/>
         </w:rPr>
         <w:t>Applied data mining techniques to pattern-match fire risk indicators, enabling earlier intervention windows and reducing ecosystem impact in simulated environments.</w:t>
       </w:r>
@@ -1168,8 +1282,8 @@
         <w:rPr>
           <w:rFonts w:ascii="Garamond" w:eastAsia="Garamond" w:hAnsi="Garamond" w:cs="Garamond"/>
           <w:color w:val="404040"/>
-          <w:sz w:val="4"/>
-          <w:szCs w:val="4"/>
+          <w:sz w:val="6"/>
+          <w:szCs w:val="6"/>
         </w:rPr>
       </w:pPr>
     </w:p>
@@ -1183,8 +1297,8 @@
         <w:rPr>
           <w:rFonts w:ascii="Garamond" w:eastAsia="Garamond" w:hAnsi="Garamond" w:cs="Garamond"/>
           <w:color w:val="404040"/>
-          <w:sz w:val="4"/>
-          <w:szCs w:val="4"/>
+          <w:sz w:val="6"/>
+          <w:szCs w:val="6"/>
         </w:rPr>
       </w:pPr>
     </w:p>
@@ -1199,8 +1313,8 @@
         </w:tabs>
         <w:rPr>
           <w:rFonts w:ascii="Garamond" w:eastAsia="Garamond" w:hAnsi="Garamond" w:cs="Garamond"/>
-          <w:sz w:val="20"/>
-          <w:szCs w:val="20"/>
+          <w:sz w:val="22"/>
+          <w:szCs w:val="22"/>
         </w:rPr>
       </w:pPr>
       <w:r>
@@ -1208,16 +1322,16 @@
           <w:rFonts w:ascii="Garamond" w:eastAsia="Garamond" w:hAnsi="Garamond" w:cs="Garamond"/>
           <w:b/>
           <w:color w:val="404040"/>
-          <w:sz w:val="20"/>
-          <w:szCs w:val="20"/>
+          <w:sz w:val="22"/>
+          <w:szCs w:val="22"/>
         </w:rPr>
         <w:t>CERTFICATES</w:t>
       </w:r>
       <w:r>
         <w:rPr>
           <w:rFonts w:ascii="Garamond" w:eastAsia="Garamond" w:hAnsi="Garamond" w:cs="Garamond"/>
-          <w:sz w:val="20"/>
-          <w:szCs w:val="20"/>
+          <w:sz w:val="22"/>
+          <w:szCs w:val="22"/>
         </w:rPr>
         <w:tab/>
       </w:r>
@@ -1231,8 +1345,8 @@
         <w:rPr>
           <w:rFonts w:ascii="Garamond" w:eastAsia="Garamond" w:hAnsi="Garamond" w:cs="Garamond"/>
           <w:color w:val="404040"/>
-          <w:sz w:val="4"/>
-          <w:szCs w:val="4"/>
+          <w:sz w:val="6"/>
+          <w:szCs w:val="6"/>
         </w:rPr>
       </w:pPr>
     </w:p>
@@ -1258,16 +1372,16 @@
         <w:rPr>
           <w:rFonts w:ascii="Garamond" w:eastAsia="Garamond" w:hAnsi="Garamond" w:cs="Garamond"/>
           <w:color w:val="000000"/>
-          <w:sz w:val="20"/>
-          <w:szCs w:val="20"/>
+          <w:sz w:val="22"/>
+          <w:szCs w:val="22"/>
         </w:rPr>
       </w:pPr>
       <w:r>
         <w:rPr>
           <w:rFonts w:ascii="Garamond" w:eastAsia="Garamond" w:hAnsi="Garamond" w:cs="Garamond"/>
           <w:color w:val="000000"/>
-          <w:sz w:val="20"/>
-          <w:szCs w:val="20"/>
+          <w:sz w:val="22"/>
+          <w:szCs w:val="22"/>
         </w:rPr>
         <w:t>Data analytics and Visualization job simulation</w:t>
       </w:r>
@@ -1275,8 +1389,8 @@
         <w:rPr>
           <w:rFonts w:ascii="Garamond" w:eastAsia="Garamond" w:hAnsi="Garamond" w:cs="Garamond"/>
           <w:color w:val="000000"/>
-          <w:sz w:val="20"/>
-          <w:szCs w:val="20"/>
+          <w:sz w:val="22"/>
+          <w:szCs w:val="22"/>
         </w:rPr>
         <w:t>.</w:t>
       </w:r>
@@ -1303,16 +1417,16 @@
         <w:rPr>
           <w:rFonts w:ascii="Garamond" w:eastAsia="Garamond" w:hAnsi="Garamond" w:cs="Garamond"/>
           <w:color w:val="000000"/>
-          <w:sz w:val="20"/>
-          <w:szCs w:val="20"/>
+          <w:sz w:val="22"/>
+          <w:szCs w:val="22"/>
         </w:rPr>
       </w:pPr>
       <w:r>
         <w:rPr>
           <w:rFonts w:ascii="Garamond" w:eastAsia="Garamond" w:hAnsi="Garamond" w:cs="Garamond"/>
           <w:color w:val="000000"/>
-          <w:sz w:val="20"/>
-          <w:szCs w:val="20"/>
+          <w:sz w:val="22"/>
+          <w:szCs w:val="22"/>
         </w:rPr>
         <w:t>Ethics in the Age of Generative AI.</w:t>
       </w:r>
@@ -1339,8 +1453,8 @@
         <w:rPr>
           <w:rFonts w:ascii="Garamond" w:eastAsia="Garamond" w:hAnsi="Garamond" w:cs="Garamond"/>
           <w:color w:val="000000"/>
-          <w:sz w:val="20"/>
-          <w:szCs w:val="20"/>
+          <w:sz w:val="22"/>
+          <w:szCs w:val="22"/>
           <w:lang w:val="en-IN"/>
         </w:rPr>
       </w:pPr>
@@ -1348,8 +1462,8 @@
         <w:rPr>
           <w:rFonts w:ascii="Garamond" w:eastAsia="Garamond" w:hAnsi="Garamond" w:cs="Garamond"/>
           <w:color w:val="000000"/>
-          <w:sz w:val="20"/>
-          <w:szCs w:val="20"/>
+          <w:sz w:val="22"/>
+          <w:szCs w:val="22"/>
           <w:lang w:val="en-IN"/>
         </w:rPr>
         <w:t>Microsoft Certified: Power BI Data Analyst Associate (PL-300)</w:t>
@@ -1365,8 +1479,8 @@
         <w:rPr>
           <w:rFonts w:ascii="Garamond" w:eastAsia="Garamond" w:hAnsi="Garamond" w:cs="Garamond"/>
           <w:color w:val="404040"/>
-          <w:sz w:val="4"/>
-          <w:szCs w:val="4"/>
+          <w:sz w:val="6"/>
+          <w:szCs w:val="6"/>
         </w:rPr>
       </w:pPr>
     </w:p>
@@ -1381,25 +1495,43 @@
         </w:tabs>
         <w:rPr>
           <w:rFonts w:ascii="Garamond" w:eastAsia="Garamond" w:hAnsi="Garamond" w:cs="Garamond"/>
-          <w:sz w:val="20"/>
-          <w:szCs w:val="20"/>
-        </w:rPr>
-      </w:pPr>
-      <w:r>
-        <w:rPr>
-          <w:rFonts w:ascii="Garamond" w:eastAsia="Garamond" w:hAnsi="Garamond" w:cs="Garamond"/>
           <w:b/>
           <w:color w:val="404040"/>
-          <w:sz w:val="20"/>
-          <w:szCs w:val="20"/>
+          <w:sz w:val="22"/>
+          <w:szCs w:val="22"/>
+        </w:rPr>
+      </w:pPr>
+    </w:p>
+    <w:p>
+      <w:pPr>
+        <w:pStyle w:val="Normal1"/>
+        <w:pBdr>
+          <w:bottom w:val="single" w:sz="6" w:space="1" w:color="000000"/>
+        </w:pBdr>
+        <w:tabs>
+          <w:tab w:val="left" w:pos="900"/>
+        </w:tabs>
+        <w:rPr>
+          <w:rFonts w:ascii="Garamond" w:eastAsia="Garamond" w:hAnsi="Garamond" w:cs="Garamond"/>
+          <w:sz w:val="22"/>
+          <w:szCs w:val="22"/>
+        </w:rPr>
+      </w:pPr>
+      <w:r>
+        <w:rPr>
+          <w:rFonts w:ascii="Garamond" w:eastAsia="Garamond" w:hAnsi="Garamond" w:cs="Garamond"/>
+          <w:b/>
+          <w:color w:val="404040"/>
+          <w:sz w:val="22"/>
+          <w:szCs w:val="22"/>
         </w:rPr>
         <w:t>ADDITIONAL</w:t>
       </w:r>
       <w:r>
         <w:rPr>
           <w:rFonts w:ascii="Garamond" w:eastAsia="Garamond" w:hAnsi="Garamond" w:cs="Garamond"/>
-          <w:sz w:val="20"/>
-          <w:szCs w:val="20"/>
+          <w:sz w:val="22"/>
+          <w:szCs w:val="22"/>
         </w:rPr>
         <w:tab/>
       </w:r>
@@ -1413,8 +1545,8 @@
         </w:tabs>
         <w:rPr>
           <w:rFonts w:ascii="Garamond" w:eastAsia="Garamond" w:hAnsi="Garamond" w:cs="Garamond"/>
-          <w:sz w:val="4"/>
-          <w:szCs w:val="4"/>
+          <w:sz w:val="6"/>
+          <w:szCs w:val="6"/>
         </w:rPr>
       </w:pPr>
     </w:p>
@@ -1427,8 +1559,8 @@
         </w:tabs>
         <w:rPr>
           <w:rFonts w:ascii="Garamond" w:eastAsia="Garamond" w:hAnsi="Garamond" w:cs="Garamond"/>
-          <w:sz w:val="4"/>
-          <w:szCs w:val="4"/>
+          <w:sz w:val="6"/>
+          <w:szCs w:val="6"/>
         </w:rPr>
       </w:pPr>
     </w:p>
@@ -1441,32 +1573,32 @@
         </w:tabs>
         <w:rPr>
           <w:rFonts w:ascii="Garamond" w:eastAsia="Garamond" w:hAnsi="Garamond" w:cs="Garamond"/>
-          <w:sz w:val="20"/>
-          <w:szCs w:val="20"/>
+          <w:sz w:val="22"/>
+          <w:szCs w:val="22"/>
         </w:rPr>
       </w:pPr>
       <w:r>
         <w:rPr>
           <w:rFonts w:ascii="Garamond" w:eastAsia="Garamond" w:hAnsi="Garamond" w:cs="Garamond"/>
           <w:b/>
-          <w:sz w:val="20"/>
-          <w:szCs w:val="20"/>
+          <w:sz w:val="22"/>
+          <w:szCs w:val="22"/>
         </w:rPr>
         <w:t>Technical Skills</w:t>
       </w:r>
       <w:r>
         <w:rPr>
           <w:rFonts w:ascii="Garamond" w:eastAsia="Garamond" w:hAnsi="Garamond" w:cs="Garamond"/>
-          <w:sz w:val="20"/>
-          <w:szCs w:val="20"/>
+          <w:sz w:val="22"/>
+          <w:szCs w:val="22"/>
         </w:rPr>
         <w:t>:</w:t>
       </w:r>
       <w:r>
         <w:rPr>
           <w:rFonts w:ascii="Garamond" w:eastAsia="Garamond" w:hAnsi="Garamond" w:cs="Garamond"/>
-          <w:sz w:val="20"/>
-          <w:szCs w:val="20"/>
+          <w:sz w:val="22"/>
+          <w:szCs w:val="22"/>
         </w:rPr>
         <w:t xml:space="preserve"> </w:t>
       </w:r>
@@ -1481,8 +1613,8 @@
         <w:ind w:left="630"/>
         <w:rPr>
           <w:rFonts w:ascii="Garamond" w:eastAsia="Garamond" w:hAnsi="Garamond" w:cs="Garamond"/>
-          <w:sz w:val="20"/>
-          <w:szCs w:val="20"/>
+          <w:sz w:val="22"/>
+          <w:szCs w:val="22"/>
         </w:rPr>
       </w:pPr>
       <w:r>
@@ -1490,16 +1622,16 @@
           <w:rFonts w:ascii="Garamond" w:eastAsia="Garamond" w:hAnsi="Garamond" w:cs="Garamond"/>
           <w:b/>
           <w:bCs/>
-          <w:sz w:val="20"/>
-          <w:szCs w:val="20"/>
+          <w:sz w:val="22"/>
+          <w:szCs w:val="22"/>
         </w:rPr>
         <w:t>AI &amp; ML:</w:t>
       </w:r>
       <w:r>
         <w:rPr>
           <w:rFonts w:ascii="Garamond" w:eastAsia="Garamond" w:hAnsi="Garamond" w:cs="Garamond"/>
-          <w:sz w:val="20"/>
-          <w:szCs w:val="20"/>
+          <w:sz w:val="22"/>
+          <w:szCs w:val="22"/>
         </w:rPr>
         <w:t xml:space="preserve"> Python, Machine Learning, NLP, LLM Fine-tuning, Agentic Workflows, Prompt Engineering</w:t>
       </w:r>
@@ -1514,8 +1646,8 @@
         <w:ind w:left="630"/>
         <w:rPr>
           <w:rFonts w:ascii="Garamond" w:eastAsia="Garamond" w:hAnsi="Garamond" w:cs="Garamond"/>
-          <w:sz w:val="20"/>
-          <w:szCs w:val="20"/>
+          <w:sz w:val="22"/>
+          <w:szCs w:val="22"/>
         </w:rPr>
       </w:pPr>
       <w:r>
@@ -1523,16 +1655,16 @@
           <w:rFonts w:ascii="Garamond" w:eastAsia="Garamond" w:hAnsi="Garamond" w:cs="Garamond"/>
           <w:b/>
           <w:bCs/>
-          <w:sz w:val="20"/>
-          <w:szCs w:val="20"/>
+          <w:sz w:val="22"/>
+          <w:szCs w:val="22"/>
         </w:rPr>
         <w:t>Automation:</w:t>
       </w:r>
       <w:r>
         <w:rPr>
           <w:rFonts w:ascii="Garamond" w:eastAsia="Garamond" w:hAnsi="Garamond" w:cs="Garamond"/>
-          <w:sz w:val="20"/>
-          <w:szCs w:val="20"/>
+          <w:sz w:val="22"/>
+          <w:szCs w:val="22"/>
         </w:rPr>
         <w:t xml:space="preserve"> Automation Anywhere, Agentic Process Automation (APA), Power Automate, RPA</w:t>
       </w:r>
@@ -1547,8 +1679,8 @@
         <w:ind w:left="630"/>
         <w:rPr>
           <w:rFonts w:ascii="Garamond" w:eastAsia="Garamond" w:hAnsi="Garamond" w:cs="Garamond"/>
-          <w:sz w:val="20"/>
-          <w:szCs w:val="20"/>
+          <w:sz w:val="22"/>
+          <w:szCs w:val="22"/>
         </w:rPr>
       </w:pPr>
       <w:r>
@@ -1556,16 +1688,16 @@
           <w:rFonts w:ascii="Garamond" w:eastAsia="Garamond" w:hAnsi="Garamond" w:cs="Garamond"/>
           <w:b/>
           <w:bCs/>
-          <w:sz w:val="20"/>
-          <w:szCs w:val="20"/>
+          <w:sz w:val="22"/>
+          <w:szCs w:val="22"/>
         </w:rPr>
         <w:t>Data &amp; Analytics:</w:t>
       </w:r>
       <w:r>
         <w:rPr>
           <w:rFonts w:ascii="Garamond" w:eastAsia="Garamond" w:hAnsi="Garamond" w:cs="Garamond"/>
-          <w:sz w:val="20"/>
-          <w:szCs w:val="20"/>
+          <w:sz w:val="22"/>
+          <w:szCs w:val="22"/>
         </w:rPr>
         <w:t xml:space="preserve"> Power BI (PL-300 Certified), Data Analysis, SAP Integration, Streamlit</w:t>
       </w:r>
@@ -1580,8 +1712,8 @@
         <w:ind w:left="630"/>
         <w:rPr>
           <w:rFonts w:ascii="Garamond" w:eastAsia="Garamond" w:hAnsi="Garamond" w:cs="Garamond"/>
-          <w:sz w:val="20"/>
-          <w:szCs w:val="20"/>
+          <w:sz w:val="22"/>
+          <w:szCs w:val="22"/>
         </w:rPr>
       </w:pPr>
       <w:r>
@@ -1589,16 +1721,16 @@
           <w:rFonts w:ascii="Garamond" w:eastAsia="Garamond" w:hAnsi="Garamond" w:cs="Garamond"/>
           <w:b/>
           <w:bCs/>
-          <w:sz w:val="20"/>
-          <w:szCs w:val="20"/>
+          <w:sz w:val="22"/>
+          <w:szCs w:val="22"/>
         </w:rPr>
         <w:t>Development:</w:t>
       </w:r>
       <w:r>
         <w:rPr>
           <w:rFonts w:ascii="Garamond" w:eastAsia="Garamond" w:hAnsi="Garamond" w:cs="Garamond"/>
-          <w:sz w:val="20"/>
-          <w:szCs w:val="20"/>
+          <w:sz w:val="22"/>
+          <w:szCs w:val="22"/>
         </w:rPr>
         <w:t xml:space="preserve"> Git, Postman, HTML, CSS, JavaScript</w:t>
       </w:r>
@@ -1613,8 +1745,8 @@
         <w:ind w:left="630"/>
         <w:rPr>
           <w:rFonts w:ascii="Garamond" w:eastAsia="Garamond" w:hAnsi="Garamond" w:cs="Garamond"/>
-          <w:sz w:val="20"/>
-          <w:szCs w:val="20"/>
+          <w:sz w:val="22"/>
+          <w:szCs w:val="22"/>
         </w:rPr>
       </w:pPr>
       <w:r>
@@ -1622,46 +1754,18 @@
           <w:rFonts w:ascii="Garamond" w:eastAsia="Garamond" w:hAnsi="Garamond" w:cs="Garamond"/>
           <w:b/>
           <w:bCs/>
-          <w:sz w:val="20"/>
-          <w:szCs w:val="20"/>
-        </w:rPr>
-        <w:t>API</w:t>
-      </w:r>
-      <w:r>
-        <w:rPr>
-          <w:rFonts w:ascii="Garamond" w:eastAsia="Garamond" w:hAnsi="Garamond" w:cs="Garamond"/>
-          <w:b/>
-          <w:bCs/>
-          <w:sz w:val="20"/>
-          <w:szCs w:val="20"/>
-        </w:rPr>
-        <w:t>’</w:t>
-      </w:r>
-      <w:r>
-        <w:rPr>
-          <w:rFonts w:ascii="Garamond" w:eastAsia="Garamond" w:hAnsi="Garamond" w:cs="Garamond"/>
-          <w:b/>
-          <w:bCs/>
-          <w:sz w:val="20"/>
-          <w:szCs w:val="20"/>
-        </w:rPr>
-        <w:t>s &amp; Platforms</w:t>
-      </w:r>
-      <w:r>
-        <w:rPr>
-          <w:rFonts w:ascii="Garamond" w:eastAsia="Garamond" w:hAnsi="Garamond" w:cs="Garamond"/>
-          <w:sz w:val="20"/>
-          <w:szCs w:val="20"/>
-        </w:rPr>
-        <w:t>: Gemini API, Google Cloud</w:t>
-      </w:r>
-      <w:r>
-        <w:rPr>
-          <w:rFonts w:ascii="Garamond" w:eastAsia="Garamond" w:hAnsi="Garamond" w:cs="Garamond"/>
-          <w:sz w:val="20"/>
-          <w:szCs w:val="20"/>
-        </w:rPr>
-        <w:t xml:space="preserve"> Platform</w:t>
+          <w:sz w:val="22"/>
+          <w:szCs w:val="22"/>
+        </w:rPr>
+        <w:t>API’s &amp; Platforms</w:t>
+      </w:r>
+      <w:r>
+        <w:rPr>
+          <w:rFonts w:ascii="Garamond" w:eastAsia="Garamond" w:hAnsi="Garamond" w:cs="Garamond"/>
+          <w:sz w:val="22"/>
+          <w:szCs w:val="22"/>
+        </w:rPr>
+        <w:t>: Gemini API, Google Cloud Platform</w:t>
       </w:r>
     </w:p>
     <w:sectPr>
@@ -1829,6 +1933,268 @@
     </w:lvl>
   </w:abstractNum>
   <w:abstractNum w:abstractNumId="1" w15:restartNumberingAfterBreak="0">
+    <w:nsid w:val="05FD69B2"/>
+    <w:multiLevelType w:val="multilevel"/>
+    <w:tmpl w:val="3190BFD4"/>
+    <w:lvl w:ilvl="0">
+      <w:start w:val="1"/>
+      <w:numFmt w:val="bullet"/>
+      <w:lvlText w:val=""/>
+      <w:lvlJc w:val="left"/>
+      <w:pPr>
+        <w:tabs>
+          <w:tab w:val="num" w:pos="720"/>
+        </w:tabs>
+        <w:ind w:left="720" w:hanging="360"/>
+      </w:pPr>
+      <w:rPr>
+        <w:rFonts w:ascii="Symbol" w:hAnsi="Symbol" w:hint="default"/>
+        <w:sz w:val="20"/>
+      </w:rPr>
+    </w:lvl>
+    <w:lvl w:ilvl="1" w:tentative="1">
+      <w:start w:val="1"/>
+      <w:numFmt w:val="bullet"/>
+      <w:lvlText w:val="o"/>
+      <w:lvlJc w:val="left"/>
+      <w:pPr>
+        <w:tabs>
+          <w:tab w:val="num" w:pos="1440"/>
+        </w:tabs>
+        <w:ind w:left="1440" w:hanging="360"/>
+      </w:pPr>
+      <w:rPr>
+        <w:rFonts w:ascii="Courier New" w:hAnsi="Courier New" w:hint="default"/>
+        <w:sz w:val="20"/>
+      </w:rPr>
+    </w:lvl>
+    <w:lvl w:ilvl="2" w:tentative="1">
+      <w:start w:val="1"/>
+      <w:numFmt w:val="bullet"/>
+      <w:lvlText w:val=""/>
+      <w:lvlJc w:val="left"/>
+      <w:pPr>
+        <w:tabs>
+          <w:tab w:val="num" w:pos="2160"/>
+        </w:tabs>
+        <w:ind w:left="2160" w:hanging="360"/>
+      </w:pPr>
+      <w:rPr>
+        <w:rFonts w:ascii="Wingdings" w:hAnsi="Wingdings" w:hint="default"/>
+        <w:sz w:val="20"/>
+      </w:rPr>
+    </w:lvl>
+    <w:lvl w:ilvl="3" w:tentative="1">
+      <w:start w:val="1"/>
+      <w:numFmt w:val="bullet"/>
+      <w:lvlText w:val=""/>
+      <w:lvlJc w:val="left"/>
+      <w:pPr>
+        <w:tabs>
+          <w:tab w:val="num" w:pos="2880"/>
+        </w:tabs>
+        <w:ind w:left="2880" w:hanging="360"/>
+      </w:pPr>
+      <w:rPr>
+        <w:rFonts w:ascii="Wingdings" w:hAnsi="Wingdings" w:hint="default"/>
+        <w:sz w:val="20"/>
+      </w:rPr>
+    </w:lvl>
+    <w:lvl w:ilvl="4" w:tentative="1">
+      <w:start w:val="1"/>
+      <w:numFmt w:val="bullet"/>
+      <w:lvlText w:val=""/>
+      <w:lvlJc w:val="left"/>
+      <w:pPr>
+        <w:tabs>
+          <w:tab w:val="num" w:pos="3600"/>
+        </w:tabs>
+        <w:ind w:left="3600" w:hanging="360"/>
+      </w:pPr>
+      <w:rPr>
+        <w:rFonts w:ascii="Wingdings" w:hAnsi="Wingdings" w:hint="default"/>
+        <w:sz w:val="20"/>
+      </w:rPr>
+    </w:lvl>
+    <w:lvl w:ilvl="5" w:tentative="1">
+      <w:start w:val="1"/>
+      <w:numFmt w:val="bullet"/>
+      <w:lvlText w:val=""/>
+      <w:lvlJc w:val="left"/>
+      <w:pPr>
+        <w:tabs>
+          <w:tab w:val="num" w:pos="4320"/>
+        </w:tabs>
+        <w:ind w:left="4320" w:hanging="360"/>
+      </w:pPr>
+      <w:rPr>
+        <w:rFonts w:ascii="Wingdings" w:hAnsi="Wingdings" w:hint="default"/>
+        <w:sz w:val="20"/>
+      </w:rPr>
+    </w:lvl>
+    <w:lvl w:ilvl="6" w:tentative="1">
+      <w:start w:val="1"/>
+      <w:numFmt w:val="bullet"/>
+      <w:lvlText w:val=""/>
+      <w:lvlJc w:val="left"/>
+      <w:pPr>
+        <w:tabs>
+          <w:tab w:val="num" w:pos="5040"/>
+        </w:tabs>
+        <w:ind w:left="5040" w:hanging="360"/>
+      </w:pPr>
+      <w:rPr>
+        <w:rFonts w:ascii="Wingdings" w:hAnsi="Wingdings" w:hint="default"/>
+        <w:sz w:val="20"/>
+      </w:rPr>
+    </w:lvl>
+    <w:lvl w:ilvl="7" w:tentative="1">
+      <w:start w:val="1"/>
+      <w:numFmt w:val="bullet"/>
+      <w:lvlText w:val=""/>
+      <w:lvlJc w:val="left"/>
+      <w:pPr>
+        <w:tabs>
+          <w:tab w:val="num" w:pos="5760"/>
+        </w:tabs>
+        <w:ind w:left="5760" w:hanging="360"/>
+      </w:pPr>
+      <w:rPr>
+        <w:rFonts w:ascii="Wingdings" w:hAnsi="Wingdings" w:hint="default"/>
+        <w:sz w:val="20"/>
+      </w:rPr>
+    </w:lvl>
+    <w:lvl w:ilvl="8" w:tentative="1">
+      <w:start w:val="1"/>
+      <w:numFmt w:val="bullet"/>
+      <w:lvlText w:val=""/>
+      <w:lvlJc w:val="left"/>
+      <w:pPr>
+        <w:tabs>
+          <w:tab w:val="num" w:pos="6480"/>
+        </w:tabs>
+        <w:ind w:left="6480" w:hanging="360"/>
+      </w:pPr>
+      <w:rPr>
+        <w:rFonts w:ascii="Wingdings" w:hAnsi="Wingdings" w:hint="default"/>
+        <w:sz w:val="20"/>
+      </w:rPr>
+    </w:lvl>
+  </w:abstractNum>
+  <w:abstractNum w:abstractNumId="2" w15:restartNumberingAfterBreak="0">
+    <w:nsid w:val="0DC56E1C"/>
+    <w:multiLevelType w:val="hybridMultilevel"/>
+    <w:tmpl w:val="08DA0B1C"/>
+    <w:lvl w:ilvl="0" w:tplc="40090001">
+      <w:start w:val="1"/>
+      <w:numFmt w:val="bullet"/>
+      <w:lvlText w:val=""/>
+      <w:lvlJc w:val="left"/>
+      <w:pPr>
+        <w:ind w:left="720" w:hanging="360"/>
+      </w:pPr>
+      <w:rPr>
+        <w:rFonts w:ascii="Symbol" w:hAnsi="Symbol" w:hint="default"/>
+      </w:rPr>
+    </w:lvl>
+    <w:lvl w:ilvl="1" w:tplc="40090003" w:tentative="1">
+      <w:start w:val="1"/>
+      <w:numFmt w:val="bullet"/>
+      <w:lvlText w:val="o"/>
+      <w:lvlJc w:val="left"/>
+      <w:pPr>
+        <w:ind w:left="1440" w:hanging="360"/>
+      </w:pPr>
+      <w:rPr>
+        <w:rFonts w:ascii="Courier New" w:hAnsi="Courier New" w:cs="Courier New" w:hint="default"/>
+      </w:rPr>
+    </w:lvl>
+    <w:lvl w:ilvl="2" w:tplc="40090005" w:tentative="1">
+      <w:start w:val="1"/>
+      <w:numFmt w:val="bullet"/>
+      <w:lvlText w:val=""/>
+      <w:lvlJc w:val="left"/>
+      <w:pPr>
+        <w:ind w:left="2160" w:hanging="360"/>
+      </w:pPr>
+      <w:rPr>
+        <w:rFonts w:ascii="Wingdings" w:hAnsi="Wingdings" w:hint="default"/>
+      </w:rPr>
+    </w:lvl>
+    <w:lvl w:ilvl="3" w:tplc="40090001" w:tentative="1">
+      <w:start w:val="1"/>
+      <w:numFmt w:val="bullet"/>
+      <w:lvlText w:val=""/>
+      <w:lvlJc w:val="left"/>
+      <w:pPr>
+        <w:ind w:left="2880" w:hanging="360"/>
+      </w:pPr>
+      <w:rPr>
+        <w:rFonts w:ascii="Symbol" w:hAnsi="Symbol" w:hint="default"/>
+      </w:rPr>
+    </w:lvl>
+    <w:lvl w:ilvl="4" w:tplc="40090003" w:tentative="1">
+      <w:start w:val="1"/>
+      <w:numFmt w:val="bullet"/>
+      <w:lvlText w:val="o"/>
+      <w:lvlJc w:val="left"/>
+      <w:pPr>
+        <w:ind w:left="3600" w:hanging="360"/>
+      </w:pPr>
+      <w:rPr>
+        <w:rFonts w:ascii="Courier New" w:hAnsi="Courier New" w:cs="Courier New" w:hint="default"/>
+      </w:rPr>
+    </w:lvl>
+    <w:lvl w:ilvl="5" w:tplc="40090005" w:tentative="1">
+      <w:start w:val="1"/>
+      <w:numFmt w:val="bullet"/>
+      <w:lvlText w:val=""/>
+      <w:lvlJc w:val="left"/>
+      <w:pPr>
+        <w:ind w:left="4320" w:hanging="360"/>
+      </w:pPr>
+      <w:rPr>
+        <w:rFonts w:ascii="Wingdings" w:hAnsi="Wingdings" w:hint="default"/>
+      </w:rPr>
+    </w:lvl>
+    <w:lvl w:ilvl="6" w:tplc="40090001" w:tentative="1">
+      <w:start w:val="1"/>
+      <w:numFmt w:val="bullet"/>
+      <w:lvlText w:val=""/>
+      <w:lvlJc w:val="left"/>
+      <w:pPr>
+        <w:ind w:left="5040" w:hanging="360"/>
+      </w:pPr>
+      <w:rPr>
+        <w:rFonts w:ascii="Symbol" w:hAnsi="Symbol" w:hint="default"/>
+      </w:rPr>
+    </w:lvl>
+    <w:lvl w:ilvl="7" w:tplc="40090003" w:tentative="1">
+      <w:start w:val="1"/>
+      <w:numFmt w:val="bullet"/>
+      <w:lvlText w:val="o"/>
+      <w:lvlJc w:val="left"/>
+      <w:pPr>
+        <w:ind w:left="5760" w:hanging="360"/>
+      </w:pPr>
+      <w:rPr>
+        <w:rFonts w:ascii="Courier New" w:hAnsi="Courier New" w:cs="Courier New" w:hint="default"/>
+      </w:rPr>
+    </w:lvl>
+    <w:lvl w:ilvl="8" w:tplc="40090005" w:tentative="1">
+      <w:start w:val="1"/>
+      <w:numFmt w:val="bullet"/>
+      <w:lvlText w:val=""/>
+      <w:lvlJc w:val="left"/>
+      <w:pPr>
+        <w:ind w:left="6480" w:hanging="360"/>
+      </w:pPr>
+      <w:rPr>
+        <w:rFonts w:ascii="Wingdings" w:hAnsi="Wingdings" w:hint="default"/>
+      </w:rPr>
+    </w:lvl>
+  </w:abstractNum>
+  <w:abstractNum w:abstractNumId="3" w15:restartNumberingAfterBreak="0">
     <w:nsid w:val="116042C6"/>
     <w:multiLevelType w:val="hybridMultilevel"/>
     <w:tmpl w:val="C022874C"/>
@@ -1941,7 +2307,7 @@
       </w:rPr>
     </w:lvl>
   </w:abstractNum>
-  <w:abstractNum w:abstractNumId="2" w15:restartNumberingAfterBreak="0">
+  <w:abstractNum w:abstractNumId="4" w15:restartNumberingAfterBreak="0">
     <w:nsid w:val="22DB551B"/>
     <w:multiLevelType w:val="multilevel"/>
     <w:tmpl w:val="7B54E6D2"/>
@@ -2063,7 +2429,7 @@
       </w:rPr>
     </w:lvl>
   </w:abstractNum>
-  <w:abstractNum w:abstractNumId="3" w15:restartNumberingAfterBreak="0">
+  <w:abstractNum w:abstractNumId="5" w15:restartNumberingAfterBreak="0">
     <w:nsid w:val="280B5952"/>
     <w:multiLevelType w:val="multilevel"/>
     <w:tmpl w:val="AA308100"/>
@@ -2212,7 +2578,7 @@
       </w:rPr>
     </w:lvl>
   </w:abstractNum>
-  <w:abstractNum w:abstractNumId="4" w15:restartNumberingAfterBreak="0">
+  <w:abstractNum w:abstractNumId="6" w15:restartNumberingAfterBreak="0">
     <w:nsid w:val="2BF74E86"/>
     <w:multiLevelType w:val="multilevel"/>
     <w:tmpl w:val="7B54E6D2"/>
@@ -2334,7 +2700,7 @@
       </w:rPr>
     </w:lvl>
   </w:abstractNum>
-  <w:abstractNum w:abstractNumId="5" w15:restartNumberingAfterBreak="0">
+  <w:abstractNum w:abstractNumId="7" w15:restartNumberingAfterBreak="0">
     <w:nsid w:val="2DAB47D1"/>
     <w:multiLevelType w:val="hybridMultilevel"/>
     <w:tmpl w:val="9E26A928"/>
@@ -2447,7 +2813,156 @@
       </w:rPr>
     </w:lvl>
   </w:abstractNum>
-  <w:abstractNum w:abstractNumId="6" w15:restartNumberingAfterBreak="0">
+  <w:abstractNum w:abstractNumId="8" w15:restartNumberingAfterBreak="0">
+    <w:nsid w:val="33DD5D98"/>
+    <w:multiLevelType w:val="multilevel"/>
+    <w:tmpl w:val="C178C1F4"/>
+    <w:lvl w:ilvl="0">
+      <w:start w:val="1"/>
+      <w:numFmt w:val="bullet"/>
+      <w:lvlText w:val=""/>
+      <w:lvlJc w:val="left"/>
+      <w:pPr>
+        <w:tabs>
+          <w:tab w:val="num" w:pos="720"/>
+        </w:tabs>
+        <w:ind w:left="720" w:hanging="360"/>
+      </w:pPr>
+      <w:rPr>
+        <w:rFonts w:ascii="Symbol" w:hAnsi="Symbol" w:hint="default"/>
+        <w:sz w:val="20"/>
+      </w:rPr>
+    </w:lvl>
+    <w:lvl w:ilvl="1" w:tentative="1">
+      <w:start w:val="1"/>
+      <w:numFmt w:val="bullet"/>
+      <w:lvlText w:val="o"/>
+      <w:lvlJc w:val="left"/>
+      <w:pPr>
+        <w:tabs>
+          <w:tab w:val="num" w:pos="1440"/>
+        </w:tabs>
+        <w:ind w:left="1440" w:hanging="360"/>
+      </w:pPr>
+      <w:rPr>
+        <w:rFonts w:ascii="Courier New" w:hAnsi="Courier New" w:hint="default"/>
+        <w:sz w:val="20"/>
+      </w:rPr>
+    </w:lvl>
+    <w:lvl w:ilvl="2" w:tentative="1">
+      <w:start w:val="1"/>
+      <w:numFmt w:val="bullet"/>
+      <w:lvlText w:val=""/>
+      <w:lvlJc w:val="left"/>
+      <w:pPr>
+        <w:tabs>
+          <w:tab w:val="num" w:pos="2160"/>
+        </w:tabs>
+        <w:ind w:left="2160" w:hanging="360"/>
+      </w:pPr>
+      <w:rPr>
+        <w:rFonts w:ascii="Wingdings" w:hAnsi="Wingdings" w:hint="default"/>
+        <w:sz w:val="20"/>
+      </w:rPr>
+    </w:lvl>
+    <w:lvl w:ilvl="3" w:tentative="1">
+      <w:start w:val="1"/>
+      <w:numFmt w:val="bullet"/>
+      <w:lvlText w:val=""/>
+      <w:lvlJc w:val="left"/>
+      <w:pPr>
+        <w:tabs>
+          <w:tab w:val="num" w:pos="2880"/>
+        </w:tabs>
+        <w:ind w:left="2880" w:hanging="360"/>
+      </w:pPr>
+      <w:rPr>
+        <w:rFonts w:ascii="Wingdings" w:hAnsi="Wingdings" w:hint="default"/>
+        <w:sz w:val="20"/>
+      </w:rPr>
+    </w:lvl>
+    <w:lvl w:ilvl="4" w:tentative="1">
+      <w:start w:val="1"/>
+      <w:numFmt w:val="bullet"/>
+      <w:lvlText w:val=""/>
+      <w:lvlJc w:val="left"/>
+      <w:pPr>
+        <w:tabs>
+          <w:tab w:val="num" w:pos="3600"/>
+        </w:tabs>
+        <w:ind w:left="3600" w:hanging="360"/>
+      </w:pPr>
+      <w:rPr>
+        <w:rFonts w:ascii="Wingdings" w:hAnsi="Wingdings" w:hint="default"/>
+        <w:sz w:val="20"/>
+      </w:rPr>
+    </w:lvl>
+    <w:lvl w:ilvl="5" w:tentative="1">
+      <w:start w:val="1"/>
+      <w:numFmt w:val="bullet"/>
+      <w:lvlText w:val=""/>
+      <w:lvlJc w:val="left"/>
+      <w:pPr>
+        <w:tabs>
+          <w:tab w:val="num" w:pos="4320"/>
+        </w:tabs>
+        <w:ind w:left="4320" w:hanging="360"/>
+      </w:pPr>
+      <w:rPr>
+        <w:rFonts w:ascii="Wingdings" w:hAnsi="Wingdings" w:hint="default"/>
+        <w:sz w:val="20"/>
+      </w:rPr>
+    </w:lvl>
+    <w:lvl w:ilvl="6" w:tentative="1">
+      <w:start w:val="1"/>
+      <w:numFmt w:val="bullet"/>
+      <w:lvlText w:val=""/>
+      <w:lvlJc w:val="left"/>
+      <w:pPr>
+        <w:tabs>
+          <w:tab w:val="num" w:pos="5040"/>
+        </w:tabs>
+        <w:ind w:left="5040" w:hanging="360"/>
+      </w:pPr>
+      <w:rPr>
+        <w:rFonts w:ascii="Wingdings" w:hAnsi="Wingdings" w:hint="default"/>
+        <w:sz w:val="20"/>
+      </w:rPr>
+    </w:lvl>
+    <w:lvl w:ilvl="7" w:tentative="1">
+      <w:start w:val="1"/>
+      <w:numFmt w:val="bullet"/>
+      <w:lvlText w:val=""/>
+      <w:lvlJc w:val="left"/>
+      <w:pPr>
+        <w:tabs>
+          <w:tab w:val="num" w:pos="5760"/>
+        </w:tabs>
+        <w:ind w:left="5760" w:hanging="360"/>
+      </w:pPr>
+      <w:rPr>
+        <w:rFonts w:ascii="Wingdings" w:hAnsi="Wingdings" w:hint="default"/>
+        <w:sz w:val="20"/>
+      </w:rPr>
+    </w:lvl>
+    <w:lvl w:ilvl="8" w:tentative="1">
+      <w:start w:val="1"/>
+      <w:numFmt w:val="bullet"/>
+      <w:lvlText w:val=""/>
+      <w:lvlJc w:val="left"/>
+      <w:pPr>
+        <w:tabs>
+          <w:tab w:val="num" w:pos="6480"/>
+        </w:tabs>
+        <w:ind w:left="6480" w:hanging="360"/>
+      </w:pPr>
+      <w:rPr>
+        <w:rFonts w:ascii="Wingdings" w:hAnsi="Wingdings" w:hint="default"/>
+        <w:sz w:val="20"/>
+      </w:rPr>
+    </w:lvl>
+  </w:abstractNum>
+  <w:abstractNum w:abstractNumId="9" w15:restartNumberingAfterBreak="0">
     <w:nsid w:val="3627382B"/>
     <w:multiLevelType w:val="hybridMultilevel"/>
     <w:tmpl w:val="8CFC0846"/>
@@ -2560,7 +3075,7 @@
       </w:rPr>
     </w:lvl>
   </w:abstractNum>
-  <w:abstractNum w:abstractNumId="7" w15:restartNumberingAfterBreak="0">
+  <w:abstractNum w:abstractNumId="10" w15:restartNumberingAfterBreak="0">
     <w:nsid w:val="3A5F7FD1"/>
     <w:multiLevelType w:val="multilevel"/>
     <w:tmpl w:val="7B54E6D2"/>
@@ -2682,7 +3197,7 @@
       </w:rPr>
     </w:lvl>
   </w:abstractNum>
-  <w:abstractNum w:abstractNumId="8" w15:restartNumberingAfterBreak="0">
+  <w:abstractNum w:abstractNumId="11" w15:restartNumberingAfterBreak="0">
     <w:nsid w:val="3ADF2EBE"/>
     <w:multiLevelType w:val="multilevel"/>
     <w:tmpl w:val="7B54E6D2"/>
@@ -2804,7 +3319,7 @@
       </w:rPr>
     </w:lvl>
   </w:abstractNum>
-  <w:abstractNum w:abstractNumId="9" w15:restartNumberingAfterBreak="0">
+  <w:abstractNum w:abstractNumId="12" w15:restartNumberingAfterBreak="0">
     <w:nsid w:val="4E4E56F0"/>
     <w:multiLevelType w:val="hybridMultilevel"/>
     <w:tmpl w:val="DF72C39E"/>
@@ -2917,7 +3432,7 @@
       </w:rPr>
     </w:lvl>
   </w:abstractNum>
-  <w:abstractNum w:abstractNumId="10" w15:restartNumberingAfterBreak="0">
+  <w:abstractNum w:abstractNumId="13" w15:restartNumberingAfterBreak="0">
     <w:nsid w:val="52CE7EFF"/>
     <w:multiLevelType w:val="hybridMultilevel"/>
     <w:tmpl w:val="A8D2F91A"/>
@@ -3030,7 +3545,7 @@
       </w:rPr>
     </w:lvl>
   </w:abstractNum>
-  <w:abstractNum w:abstractNumId="11" w15:restartNumberingAfterBreak="0">
+  <w:abstractNum w:abstractNumId="14" w15:restartNumberingAfterBreak="0">
     <w:nsid w:val="544A55F8"/>
     <w:multiLevelType w:val="hybridMultilevel"/>
     <w:tmpl w:val="BF0A7A12"/>
@@ -3143,7 +3658,7 @@
       </w:rPr>
     </w:lvl>
   </w:abstractNum>
-  <w:abstractNum w:abstractNumId="12" w15:restartNumberingAfterBreak="0">
+  <w:abstractNum w:abstractNumId="15" w15:restartNumberingAfterBreak="0">
     <w:nsid w:val="5C655415"/>
     <w:multiLevelType w:val="multilevel"/>
     <w:tmpl w:val="7B54E6D2"/>
@@ -3265,7 +3780,7 @@
       </w:rPr>
     </w:lvl>
   </w:abstractNum>
-  <w:abstractNum w:abstractNumId="13" w15:restartNumberingAfterBreak="0">
+  <w:abstractNum w:abstractNumId="16" w15:restartNumberingAfterBreak="0">
     <w:nsid w:val="654E2DDA"/>
     <w:multiLevelType w:val="multilevel"/>
     <w:tmpl w:val="7B54E6D2"/>
@@ -3387,7 +3902,7 @@
       </w:rPr>
     </w:lvl>
   </w:abstractNum>
-  <w:abstractNum w:abstractNumId="14" w15:restartNumberingAfterBreak="0">
+  <w:abstractNum w:abstractNumId="17" w15:restartNumberingAfterBreak="0">
     <w:nsid w:val="68F00E1F"/>
     <w:multiLevelType w:val="hybridMultilevel"/>
     <w:tmpl w:val="F7E83B98"/>
@@ -3500,7 +4015,7 @@
       </w:rPr>
     </w:lvl>
   </w:abstractNum>
-  <w:abstractNum w:abstractNumId="15" w15:restartNumberingAfterBreak="0">
+  <w:abstractNum w:abstractNumId="18" w15:restartNumberingAfterBreak="0">
     <w:nsid w:val="6CBF1EF4"/>
     <w:multiLevelType w:val="hybridMultilevel"/>
     <w:tmpl w:val="803CE3F0"/>
@@ -3613,7 +4128,7 @@
       </w:rPr>
     </w:lvl>
   </w:abstractNum>
-  <w:abstractNum w:abstractNumId="16" w15:restartNumberingAfterBreak="0">
+  <w:abstractNum w:abstractNumId="19" w15:restartNumberingAfterBreak="0">
     <w:nsid w:val="7BFB0F0C"/>
     <w:multiLevelType w:val="hybridMultilevel"/>
     <w:tmpl w:val="EC401ADA"/>
@@ -3727,55 +4242,64 @@
     </w:lvl>
   </w:abstractNum>
   <w:num w:numId="1" w16cid:durableId="577250493">
+    <w:abstractNumId w:val="10"/>
+  </w:num>
+  <w:num w:numId="2" w16cid:durableId="1267078745">
+    <w:abstractNumId w:val="16"/>
+  </w:num>
+  <w:num w:numId="3" w16cid:durableId="1507789495">
+    <w:abstractNumId w:val="11"/>
+  </w:num>
+  <w:num w:numId="4" w16cid:durableId="175853415">
+    <w:abstractNumId w:val="4"/>
+  </w:num>
+  <w:num w:numId="5" w16cid:durableId="646010237">
+    <w:abstractNumId w:val="6"/>
+  </w:num>
+  <w:num w:numId="6" w16cid:durableId="296954686">
+    <w:abstractNumId w:val="15"/>
+  </w:num>
+  <w:num w:numId="7" w16cid:durableId="390618391">
+    <w:abstractNumId w:val="19"/>
+  </w:num>
+  <w:num w:numId="8" w16cid:durableId="246577242">
+    <w:abstractNumId w:val="17"/>
+  </w:num>
+  <w:num w:numId="9" w16cid:durableId="750157063">
+    <w:abstractNumId w:val="13"/>
+  </w:num>
+  <w:num w:numId="10" w16cid:durableId="1489639546">
     <w:abstractNumId w:val="7"/>
   </w:num>
-  <w:num w:numId="2" w16cid:durableId="1267078745">
-    <w:abstractNumId w:val="13"/>
+  <w:num w:numId="11" w16cid:durableId="1066225486">
+    <w:abstractNumId w:val="9"/>
   </w:num>
-  <w:num w:numId="3" w16cid:durableId="1507789495">
-    <w:abstractNumId w:val="8"/>
+  <w:num w:numId="12" w16cid:durableId="2071808691">
+    <w:abstractNumId w:val="18"/>
   </w:num>
-  <w:num w:numId="4" w16cid:durableId="175853415">
-    <w:abstractNumId w:val="2"/>
-  </w:num>
-  <w:num w:numId="5" w16cid:durableId="646010237">
-    <w:abstractNumId w:val="4"/>
-  </w:num>
-  <w:num w:numId="6" w16cid:durableId="296954686">
+  <w:num w:numId="13" w16cid:durableId="1674607646">
     <w:abstractNumId w:val="12"/>
   </w:num>
-  <w:num w:numId="7" w16cid:durableId="390618391">
-    <w:abstractNumId w:val="16"/>
-  </w:num>
-  <w:num w:numId="8" w16cid:durableId="246577242">
-    <w:abstractNumId w:val="14"/>
-  </w:num>
-  <w:num w:numId="9" w16cid:durableId="750157063">
-    <w:abstractNumId w:val="10"/>
-  </w:num>
-  <w:num w:numId="10" w16cid:durableId="1489639546">
-    <w:abstractNumId w:val="5"/>
-  </w:num>
-  <w:num w:numId="11" w16cid:durableId="1066225486">
-    <w:abstractNumId w:val="6"/>
-  </w:num>
-  <w:num w:numId="12" w16cid:durableId="2071808691">
-    <w:abstractNumId w:val="15"/>
-  </w:num>
-  <w:num w:numId="13" w16cid:durableId="1674607646">
-    <w:abstractNumId w:val="9"/>
-  </w:num>
   <w:num w:numId="14" w16cid:durableId="7023195">
-    <w:abstractNumId w:val="1"/>
+    <w:abstractNumId w:val="3"/>
   </w:num>
   <w:num w:numId="15" w16cid:durableId="294407229">
     <w:abstractNumId w:val="0"/>
   </w:num>
   <w:num w:numId="16" w16cid:durableId="965311420">
-    <w:abstractNumId w:val="3"/>
+    <w:abstractNumId w:val="5"/>
   </w:num>
   <w:num w:numId="17" w16cid:durableId="1856069406">
-    <w:abstractNumId w:val="11"/>
+    <w:abstractNumId w:val="14"/>
+  </w:num>
+  <w:num w:numId="18" w16cid:durableId="1755122103">
+    <w:abstractNumId w:val="1"/>
+  </w:num>
+  <w:num w:numId="19" w16cid:durableId="755907894">
+    <w:abstractNumId w:val="2"/>
+  </w:num>
+  <w:num w:numId="20" w16cid:durableId="372467844">
+    <w:abstractNumId w:val="8"/>
   </w:num>
 </w:numbering>
 </file>
@@ -4279,7 +4803,6 @@
   <w:style w:type="character" w:default="1" w:styleId="DefaultParagraphFont">
     <w:name w:val="Default Paragraph Font"/>
     <w:uiPriority w:val="1"/>
-    <w:semiHidden/>
     <w:unhideWhenUsed/>
   </w:style>
   <w:style w:type="table" w:default="1" w:styleId="TableNormal">

</xml_diff>